<commit_message>
Add demo video, update schema, and tidy docs
Add DemoVideo.mp4 and update db.db and project documents (report template, diagram, Visual Paradigm backups). Seed schema.sql with watchlist and user_rating INSERTs to provide sample data for testing. Remove temporary Visual Paradigm lock/tmp files and add/rename several .vpp.bak backups. Apply minor code cleanup: remove an extra blank line in LoginFrame and normalize EOF in Main.
</commit_message>
<xml_diff>
--- a/docs/SE2232_FinalProjectReportTemplate.docx
+++ b/docs/SE2232_FinalProjectReportTemplate.docx
@@ -4612,7 +4612,7 @@
         <w:rPr>
           <w:rFonts w:cstheme="minorHAnsi"/>
         </w:rPr>
-        <w:t xml:space="preserve"> The software shall be developed using object-oriented Java principles and an IDE like NetBeans or IntelliJ IDEA, ensuring the codebase is organized for future updates. </w:t>
+        <w:t xml:space="preserve"> The software shall be developed using object-oriented Java principles and an IDE like IntelliJ IDEA, ensuring the codebase is organized for future updates. </w:t>
       </w:r>
     </w:p>
     <w:p>
@@ -4972,372 +4972,6 @@
     </w:p>
     <w:p>
       <w:pPr>
-        <w:spacing w:before="120" w:after="120" w:line="240" w:lineRule="auto"/>
-        <w:jc w:val="both"/>
-        <w:rPr>
-          <w:rFonts w:cstheme="minorHAnsi"/>
-        </w:rPr>
-      </w:pPr>
-      <w:r>
-        <w:rPr>
-          <w:rFonts w:cstheme="minorHAnsi"/>
-        </w:rPr>
-        <w:t>Prepare</w:t>
-      </w:r>
-      <w:r>
-        <w:rPr>
-          <w:rFonts w:cstheme="minorHAnsi"/>
-        </w:rPr>
-        <w:t xml:space="preserve"> the</w:t>
-      </w:r>
-      <w:r>
-        <w:rPr>
-          <w:rFonts w:cstheme="minorHAnsi"/>
-        </w:rPr>
-        <w:t xml:space="preserve"> </w:t>
-      </w:r>
-      <w:r>
-        <w:rPr>
-          <w:rFonts w:cstheme="minorHAnsi"/>
-          <w:b/>
-        </w:rPr>
-        <w:t>complete</w:t>
-      </w:r>
-      <w:r>
-        <w:rPr>
-          <w:rFonts w:cstheme="minorHAnsi"/>
-          <w:b/>
-        </w:rPr>
-        <w:t xml:space="preserve"> use case form</w:t>
-      </w:r>
-      <w:r>
-        <w:rPr>
-          <w:rFonts w:cstheme="minorHAnsi"/>
-          <w:b/>
-        </w:rPr>
-        <w:t>s</w:t>
-      </w:r>
-      <w:r>
-        <w:rPr>
-          <w:rFonts w:cstheme="minorHAnsi"/>
-        </w:rPr>
-        <w:t xml:space="preserve"> for </w:t>
-      </w:r>
-      <w:r>
-        <w:rPr>
-          <w:rFonts w:cstheme="minorHAnsi"/>
-        </w:rPr>
-        <w:t>3</w:t>
-      </w:r>
-      <w:r>
-        <w:rPr>
-          <w:rFonts w:cstheme="minorHAnsi"/>
-        </w:rPr>
-        <w:t xml:space="preserve"> </w:t>
-      </w:r>
-      <w:r>
-        <w:rPr>
-          <w:rFonts w:cstheme="minorHAnsi"/>
-        </w:rPr>
-        <w:t>use case</w:t>
-      </w:r>
-      <w:r>
-        <w:rPr>
-          <w:rFonts w:cstheme="minorHAnsi"/>
-        </w:rPr>
-        <w:t>s</w:t>
-      </w:r>
-      <w:r>
-        <w:rPr>
-          <w:rFonts w:cstheme="minorHAnsi"/>
-        </w:rPr>
-        <w:t xml:space="preserve"> </w:t>
-      </w:r>
-      <w:r>
-        <w:rPr>
-          <w:rFonts w:cstheme="minorHAnsi"/>
-        </w:rPr>
-        <w:t>that you will select</w:t>
-      </w:r>
-      <w:r>
-        <w:rPr>
-          <w:rFonts w:cstheme="minorHAnsi"/>
-        </w:rPr>
-        <w:t>.</w:t>
-      </w:r>
-      <w:r>
-        <w:rPr>
-          <w:rFonts w:cstheme="minorHAnsi"/>
-        </w:rPr>
-        <w:t xml:space="preserve"> For the rest of your use</w:t>
-      </w:r>
-      <w:r>
-        <w:rPr>
-          <w:rFonts w:cstheme="minorHAnsi"/>
-        </w:rPr>
-        <w:t xml:space="preserve"> cases</w:t>
-      </w:r>
-      <w:r>
-        <w:rPr>
-          <w:rFonts w:cstheme="minorHAnsi"/>
-        </w:rPr>
-        <w:t>, prepare</w:t>
-      </w:r>
-      <w:r>
-        <w:rPr>
-          <w:rFonts w:cstheme="minorHAnsi"/>
-        </w:rPr>
-        <w:t xml:space="preserve"> only</w:t>
-      </w:r>
-      <w:r>
-        <w:rPr>
-          <w:rFonts w:cstheme="minorHAnsi"/>
-        </w:rPr>
-        <w:t xml:space="preserve"> a </w:t>
-      </w:r>
-      <w:r>
-        <w:rPr>
-          <w:rFonts w:cstheme="minorHAnsi"/>
-          <w:b/>
-        </w:rPr>
-        <w:t>basic use case form</w:t>
-      </w:r>
-      <w:r>
-        <w:rPr>
-          <w:rFonts w:cstheme="minorHAnsi"/>
-        </w:rPr>
-        <w:t>.</w:t>
-      </w:r>
-      <w:r>
-        <w:rPr>
-          <w:rFonts w:cstheme="minorHAnsi"/>
-        </w:rPr>
-        <w:t xml:space="preserve"> </w:t>
-      </w:r>
-      <w:r>
-        <w:rPr>
-          <w:rFonts w:cstheme="minorHAnsi"/>
-          <w:b/>
-          <w:bCs/>
-          <w:u w:val="single"/>
-        </w:rPr>
-        <w:t>Note:</w:t>
-      </w:r>
-      <w:r>
-        <w:rPr>
-          <w:rFonts w:cstheme="minorHAnsi"/>
-        </w:rPr>
-        <w:t xml:space="preserve"> Do not use the scenario</w:t>
-      </w:r>
-      <w:r>
-        <w:rPr>
-          <w:rFonts w:cstheme="minorHAnsi"/>
-        </w:rPr>
-        <w:t>s written in the previous section</w:t>
-      </w:r>
-      <w:r>
-        <w:rPr>
-          <w:rFonts w:cstheme="minorHAnsi"/>
-        </w:rPr>
-        <w:t xml:space="preserve"> exactly the same as a normal course of a</w:t>
-      </w:r>
-      <w:r>
-        <w:rPr>
-          <w:rFonts w:cstheme="minorHAnsi"/>
-        </w:rPr>
-        <w:t>ny</w:t>
-      </w:r>
-      <w:r>
-        <w:rPr>
-          <w:rFonts w:cstheme="minorHAnsi"/>
-        </w:rPr>
-        <w:t xml:space="preserve"> use case.</w:t>
-      </w:r>
-    </w:p>
-    <w:p>
-      <w:pPr>
-        <w:spacing w:before="120" w:after="120" w:line="240" w:lineRule="auto"/>
-        <w:jc w:val="both"/>
-        <w:rPr>
-          <w:rFonts w:cstheme="minorHAnsi"/>
-        </w:rPr>
-      </w:pPr>
-      <w:r>
-        <w:rPr>
-          <w:rFonts w:cstheme="minorHAnsi"/>
-          <w:b/>
-          <w:bCs/>
-        </w:rPr>
-        <w:t>Complete use case form</w:t>
-      </w:r>
-      <w:r>
-        <w:rPr>
-          <w:rFonts w:cstheme="minorHAnsi"/>
-        </w:rPr>
-        <w:t xml:space="preserve"> includes the following </w:t>
-      </w:r>
-      <w:r>
-        <w:rPr>
-          <w:rFonts w:cstheme="minorHAnsi"/>
-        </w:rPr>
-        <w:t>sections</w:t>
-      </w:r>
-      <w:r>
-        <w:rPr>
-          <w:rFonts w:cstheme="minorHAnsi"/>
-        </w:rPr>
-        <w:t xml:space="preserve">: Use case name, </w:t>
-      </w:r>
-      <w:r>
-        <w:rPr>
-          <w:rFonts w:cstheme="minorHAnsi"/>
-        </w:rPr>
-        <w:t>P</w:t>
-      </w:r>
-      <w:r>
-        <w:rPr>
-          <w:rFonts w:cstheme="minorHAnsi"/>
-        </w:rPr>
-        <w:t xml:space="preserve">articipating actors, </w:t>
-      </w:r>
-      <w:r>
-        <w:rPr>
-          <w:rFonts w:cstheme="minorHAnsi"/>
-        </w:rPr>
-        <w:t>D</w:t>
-      </w:r>
-      <w:r>
-        <w:rPr>
-          <w:rFonts w:cstheme="minorHAnsi"/>
-        </w:rPr>
-        <w:t xml:space="preserve">escription, </w:t>
-      </w:r>
-      <w:r>
-        <w:rPr>
-          <w:rFonts w:cstheme="minorHAnsi"/>
-        </w:rPr>
-        <w:t>T</w:t>
-      </w:r>
-      <w:r>
-        <w:rPr>
-          <w:rFonts w:cstheme="minorHAnsi"/>
-        </w:rPr>
-        <w:t xml:space="preserve">rigger, </w:t>
-      </w:r>
-      <w:r>
-        <w:rPr>
-          <w:rFonts w:cstheme="minorHAnsi"/>
-        </w:rPr>
-        <w:t>P</w:t>
-      </w:r>
-      <w:r>
-        <w:rPr>
-          <w:rFonts w:cstheme="minorHAnsi"/>
-        </w:rPr>
-        <w:t>reconditions</w:t>
-      </w:r>
-      <w:r>
-        <w:rPr>
-          <w:rFonts w:cstheme="minorHAnsi"/>
-        </w:rPr>
-        <w:t>,</w:t>
-      </w:r>
-      <w:r>
-        <w:rPr>
-          <w:rFonts w:cstheme="minorHAnsi"/>
-        </w:rPr>
-        <w:t xml:space="preserve"> </w:t>
-      </w:r>
-      <w:r>
-        <w:rPr>
-          <w:rFonts w:cstheme="minorHAnsi"/>
-        </w:rPr>
-        <w:t>N</w:t>
-      </w:r>
-      <w:r>
-        <w:rPr>
-          <w:rFonts w:cstheme="minorHAnsi"/>
-        </w:rPr>
-        <w:t>ormal course</w:t>
-      </w:r>
-      <w:r>
-        <w:rPr>
-          <w:rFonts w:cstheme="minorHAnsi"/>
-        </w:rPr>
-        <w:t xml:space="preserve"> (Flow of events)</w:t>
-      </w:r>
-      <w:r>
-        <w:rPr>
-          <w:rFonts w:cstheme="minorHAnsi"/>
-        </w:rPr>
-        <w:t xml:space="preserve">, </w:t>
-      </w:r>
-      <w:r>
-        <w:rPr>
-          <w:rFonts w:cstheme="minorHAnsi"/>
-        </w:rPr>
-        <w:t>P</w:t>
-      </w:r>
-      <w:r>
-        <w:rPr>
-          <w:rFonts w:cstheme="minorHAnsi"/>
-        </w:rPr>
-        <w:t>ost conditions</w:t>
-      </w:r>
-      <w:r>
-        <w:rPr>
-          <w:rFonts w:cstheme="minorHAnsi"/>
-        </w:rPr>
-        <w:t xml:space="preserve">, </w:t>
-      </w:r>
-      <w:r>
-        <w:rPr>
-          <w:rFonts w:cstheme="minorHAnsi"/>
-        </w:rPr>
-        <w:t xml:space="preserve">and </w:t>
-      </w:r>
-      <w:r>
-        <w:rPr>
-          <w:rFonts w:cstheme="minorHAnsi"/>
-        </w:rPr>
-        <w:t>Exceptions.</w:t>
-      </w:r>
-    </w:p>
-    <w:p>
-      <w:pPr>
-        <w:spacing w:before="120" w:after="120" w:line="240" w:lineRule="auto"/>
-        <w:jc w:val="both"/>
-        <w:rPr>
-          <w:rFonts w:cstheme="minorHAnsi"/>
-        </w:rPr>
-      </w:pPr>
-      <w:r>
-        <w:rPr>
-          <w:rFonts w:cstheme="minorHAnsi"/>
-          <w:b/>
-          <w:bCs/>
-        </w:rPr>
-        <w:t>Basic use case form</w:t>
-      </w:r>
-      <w:r>
-        <w:rPr>
-          <w:rFonts w:cstheme="minorHAnsi"/>
-        </w:rPr>
-        <w:t xml:space="preserve"> includes the following sections: Use case name, Participating actors, Description, Trigger, Preconditions.</w:t>
-      </w:r>
-    </w:p>
-    <w:p>
-      <w:pPr>
-        <w:spacing w:before="120" w:after="120" w:line="240" w:lineRule="auto"/>
-        <w:jc w:val="both"/>
-        <w:rPr>
-          <w:rFonts w:cstheme="minorHAnsi"/>
-        </w:rPr>
-      </w:pPr>
-    </w:p>
-    <w:p>
-      <w:pPr>
-        <w:pStyle w:val="ListParagraph"/>
         <w:spacing w:before="120" w:after="120"/>
         <w:jc w:val="both"/>
         <w:rPr>
@@ -5428,7 +5062,6 @@
           <w:b/>
           <w:bCs/>
         </w:rPr>
-        <w:lastRenderedPageBreak/>
         <w:t>Description:</w:t>
       </w:r>
       <w:r>
@@ -5580,7 +5213,6 @@
     </w:p>
     <w:p>
       <w:pPr>
-        <w:pStyle w:val="ListParagraph"/>
         <w:spacing w:before="120" w:after="120"/>
         <w:jc w:val="both"/>
         <w:rPr>
@@ -5593,6 +5225,7 @@
           <w:b/>
           <w:bCs/>
         </w:rPr>
+        <w:lastRenderedPageBreak/>
         <w:t>Complete Use Case 2: Add Movie</w:t>
       </w:r>
     </w:p>
@@ -5822,7 +5455,6 @@
     </w:p>
     <w:p>
       <w:pPr>
-        <w:pStyle w:val="ListParagraph"/>
         <w:spacing w:before="120" w:after="120"/>
         <w:jc w:val="both"/>
         <w:rPr>
@@ -6064,7 +5696,6 @@
     </w:p>
     <w:p>
       <w:pPr>
-        <w:pStyle w:val="ListParagraph"/>
         <w:spacing w:before="120" w:after="120"/>
         <w:jc w:val="both"/>
         <w:rPr>
@@ -6222,7 +5853,6 @@
     </w:p>
     <w:p>
       <w:pPr>
-        <w:pStyle w:val="ListParagraph"/>
         <w:spacing w:before="120" w:after="120"/>
         <w:jc w:val="both"/>
         <w:rPr>
@@ -6369,7 +5999,6 @@
           <w:b/>
           <w:bCs/>
         </w:rPr>
-        <w:lastRenderedPageBreak/>
         <w:t>Preconditions:</w:t>
       </w:r>
       <w:r>
@@ -6381,7 +6010,6 @@
     </w:p>
     <w:p>
       <w:pPr>
-        <w:pStyle w:val="ListParagraph"/>
         <w:spacing w:before="120" w:after="120"/>
         <w:jc w:val="both"/>
         <w:rPr>
@@ -6528,6 +6156,7 @@
           <w:b/>
           <w:bCs/>
         </w:rPr>
+        <w:lastRenderedPageBreak/>
         <w:t>Preconditions:</w:t>
       </w:r>
       <w:r>
@@ -6960,8 +6589,14 @@
         <w:rPr>
           <w:rFonts w:cstheme="minorHAnsi"/>
         </w:rPr>
+        <w:t xml:space="preserve">The Use Case Diagram for the MovieCritics system identifies two primary actors — the Type-1 Parent/Adult and the Type-2 Child — that interact with the application through a shared generalized actor named User. The User actor captures the common behaviors of both roles: logging in, browsing movies, viewing family ratings, and rating or commenting on entries. The Type-1 Parent specializes the User actor and gains exclusive access to administrative use cases including Add/Remove Movies, Edit Movie Details, Manage User Accounts, Set Viewing Rules, Moderate Content, and View Analytics. The Type-2 Child </w:t>
+      </w:r>
+      <w:r>
+        <w:rPr>
+          <w:rFonts w:cstheme="minorHAnsi"/>
+        </w:rPr>
         <w:lastRenderedPageBreak/>
-        <w:t>The Use Case Diagram for the MovieCritics system identifies two primary actors — the Type-1 Parent/Adult and the Type-2 Child — that interact with the application through a shared generalized actor named User. The User actor captures the common behaviors of both roles: logging in, browsing movies, viewing family ratings, and rating or commenting on entries. The Type-1 Parent specializes the User actor and gains exclusive access to administrative use cases including Add/Remove Movies, Edit Movie Details, Manage User Accounts, Set Viewing Rules, Moderate Content, and View Analytics. The Type-2 Child specializes the User actor and gains access to engagement use cases such as Log Watched Movies, Create Personal Watchlists, and Track Progress. The Browse Movies use case is linked by an «include» relationship to a Verify Restriction use case, which enforces the parental restriction rule for Type-2 Child users when accessing movie details.</w:t>
+        <w:t>specializes the User actor and gains access to engagement use cases such as Log Watched Movies, Create Personal Watchlists, and Track Progress. The Browse Movies use case is linked by an «include» relationship to a Verify Restriction use case, which enforces the parental restriction rule for Type-2 Child users when accessing movie details.</w:t>
       </w:r>
     </w:p>
     <w:p>
@@ -7400,10 +7035,10 @@
           <w:noProof/>
         </w:rPr>
         <w:drawing>
-          <wp:inline distT="0" distB="0" distL="0" distR="0" wp14:anchorId="41F8F2ED" wp14:editId="1052413E">
-            <wp:extent cx="5943600" cy="6065520"/>
+          <wp:inline distT="0" distB="0" distL="0" distR="0" wp14:anchorId="4A8EED1E" wp14:editId="08C1E604">
+            <wp:extent cx="5943600" cy="5011420"/>
             <wp:effectExtent l="0" t="0" r="0" b="0"/>
-            <wp:docPr id="863952245" name="Picture 13"/>
+            <wp:docPr id="596896793" name="Picture 17"/>
             <wp:cNvGraphicFramePr>
               <a:graphicFrameLocks xmlns:a="http://schemas.openxmlformats.org/drawingml/2006/main" noChangeAspect="1"/>
             </wp:cNvGraphicFramePr>
@@ -7411,13 +7046,13 @@
               <a:graphicData uri="http://schemas.openxmlformats.org/drawingml/2006/picture">
                 <pic:pic xmlns:pic="http://schemas.openxmlformats.org/drawingml/2006/picture">
                   <pic:nvPicPr>
-                    <pic:cNvPr id="0" name="Picture 22"/>
+                    <pic:cNvPr id="0" name="Picture 30"/>
                     <pic:cNvPicPr>
                       <a:picLocks noChangeAspect="1" noChangeArrowheads="1"/>
                     </pic:cNvPicPr>
                   </pic:nvPicPr>
                   <pic:blipFill>
-                    <a:blip r:embed="rId12">
+                    <a:blip r:embed="rId12" cstate="print">
                       <a:extLst>
                         <a:ext uri="{28A0092B-C50C-407E-A947-70E740481C1C}">
                           <a14:useLocalDpi xmlns:a14="http://schemas.microsoft.com/office/drawing/2010/main" val="0"/>
@@ -7432,7 +7067,7 @@
                   <pic:spPr bwMode="auto">
                     <a:xfrm>
                       <a:off x="0" y="0"/>
-                      <a:ext cx="5943600" cy="6065520"/>
+                      <a:ext cx="5943600" cy="5011420"/>
                     </a:xfrm>
                     <a:prstGeom prst="rect">
                       <a:avLst/>
@@ -7461,8 +7096,14 @@
         <w:rPr>
           <w:rFonts w:cstheme="minorHAnsi"/>
         </w:rPr>
+        <w:t xml:space="preserve">The class diagram models the MovieCritics system using a three-layer object-oriented architecture. The Data Layer holds plain Java objects — User, Movie, Person, and UserRating — each of which mirrors one row of its corresponding database table. The Persistence Layer contains a single DatabaseManager class that centralizes every SQL interaction (CRUD on movies, users, persons, watchlist, and ratings; analytics queries). The Presentation Layer is composed of three top-level frames — LoginFrame, Type1MainFrame, and Type2MainFrame — with the two main frames extending an abstract BaseMainFrame that supplies </w:t>
+      </w:r>
+      <w:r>
+        <w:rPr>
+          <w:rFonts w:cstheme="minorHAnsi"/>
+        </w:rPr>
         <w:lastRenderedPageBreak/>
-        <w:t>The class diagram models the MovieCritics system using a three-layer object-oriented architecture. The Data Layer holds plain Java objects — User, Movie, Person, and UserRating — each of which mirrors one row of its corresponding database table. The Persistence Layer contains a single DatabaseManager class that centralizes every SQL interaction (CRUD on movies, users, persons, watchlist, and ratings; analytics queries). The Presentation Layer is composed of three top-level frames — LoginFrame, Type1MainFrame, and Type2MainFrame — with the two main frames extending an abstract BaseMainFrame that supplies the shared header, navigation tabs, paging controls, and filter combo helpers. The dialog package follows the same pattern: an EditDialogContract interface declares the contract, BaseEditDialog provides the common dialog shell, and MovieEditDialog and UserEditDialog extend it with entity-specific forms. RateDialog is a standalone dialog used by Type2MainFrame. The widget package contains reusable visual components (MovieCard, UserCard, FloatingLabelField, LogoAnimator) and two static helper classes (WidgetFactory for styled component construction and UIHelper for database error handling). The Main class is the entry point and is responsible only for instantiating the first LoginFrame.</w:t>
+        <w:t>the shared header, navigation tabs, paging controls, and filter combo helpers. The dialog package follows the same pattern: an EditDialogContract interface declares the contract, BaseEditDialog provides the common dialog shell, and MovieEditDialog and UserEditDialog extend it with entity-specific forms. RateDialog is a standalone dialog used by Type2MainFrame. The widget package contains reusable visual components (MovieCard, UserCard, FloatingLabelField, LogoAnimator) and two static helper classes (WidgetFactory for styled component construction and UIHelper for database error handling). The Main class is the entry point and is responsible only for instantiating the first LoginFrame.</w:t>
       </w:r>
     </w:p>
     <w:p>
@@ -7741,179 +7382,11 @@
     </w:p>
     <w:p>
       <w:pPr>
+        <w:pStyle w:val="Heading1"/>
         <w:numPr>
           <w:ilvl w:val="0"/>
-          <w:numId w:val="23"/>
+          <w:numId w:val="0"/>
         </w:numPr>
-        <w:spacing w:before="120" w:after="120" w:line="240" w:lineRule="auto"/>
-        <w:jc w:val="both"/>
-        <w:rPr>
-          <w:rFonts w:cstheme="minorHAnsi"/>
-        </w:rPr>
-      </w:pPr>
-      <w:r>
-        <w:rPr>
-          <w:rFonts w:cstheme="minorHAnsi"/>
-          <w:b/>
-          <w:bCs/>
-        </w:rPr>
-        <w:t>LoginFrame</w:t>
-      </w:r>
-      <w:r>
-        <w:rPr>
-          <w:rFonts w:cstheme="minorHAnsi"/>
-        </w:rPr>
-        <w:t> — Authentication entry point with floating-label inputs and an animated logo intro.</w:t>
-      </w:r>
-    </w:p>
-    <w:p>
-      <w:pPr>
-        <w:numPr>
-          <w:ilvl w:val="0"/>
-          <w:numId w:val="23"/>
-        </w:numPr>
-        <w:spacing w:before="120" w:after="120" w:line="240" w:lineRule="auto"/>
-        <w:jc w:val="both"/>
-        <w:rPr>
-          <w:rFonts w:cstheme="minorHAnsi"/>
-        </w:rPr>
-      </w:pPr>
-      <w:r>
-        <w:rPr>
-          <w:rFonts w:cstheme="minorHAnsi"/>
-          <w:b/>
-          <w:bCs/>
-        </w:rPr>
-        <w:t>Type1MainFrame – Accounts tab</w:t>
-      </w:r>
-      <w:r>
-        <w:rPr>
-          <w:rFonts w:cstheme="minorHAnsi"/>
-        </w:rPr>
-        <w:t> — Parent's account management grid with "+ Add User" and per-card edit access.</w:t>
-      </w:r>
-    </w:p>
-    <w:p>
-      <w:pPr>
-        <w:numPr>
-          <w:ilvl w:val="0"/>
-          <w:numId w:val="23"/>
-        </w:numPr>
-        <w:spacing w:before="120" w:after="120" w:line="240" w:lineRule="auto"/>
-        <w:jc w:val="both"/>
-        <w:rPr>
-          <w:rFonts w:cstheme="minorHAnsi"/>
-        </w:rPr>
-      </w:pPr>
-      <w:r>
-        <w:rPr>
-          <w:rFonts w:cstheme="minorHAnsi"/>
-          <w:b/>
-          <w:bCs/>
-        </w:rPr>
-        <w:lastRenderedPageBreak/>
-        <w:t>Type1MainFrame – Movies tab</w:t>
-      </w:r>
-      <w:r>
-        <w:rPr>
-          <w:rFonts w:cstheme="minorHAnsi"/>
-        </w:rPr>
-        <w:t> — Movie library with filter bar (title, genre, director, year) and "+ Add Movie" button.</w:t>
-      </w:r>
-    </w:p>
-    <w:p>
-      <w:pPr>
-        <w:numPr>
-          <w:ilvl w:val="0"/>
-          <w:numId w:val="23"/>
-        </w:numPr>
-        <w:spacing w:before="120" w:after="120" w:line="240" w:lineRule="auto"/>
-        <w:jc w:val="both"/>
-        <w:rPr>
-          <w:rFonts w:cstheme="minorHAnsi"/>
-        </w:rPr>
-      </w:pPr>
-      <w:r>
-        <w:rPr>
-          <w:rFonts w:cstheme="minorHAnsi"/>
-          <w:b/>
-          <w:bCs/>
-        </w:rPr>
-        <w:t>Type1MainFrame – Analytics tab</w:t>
-      </w:r>
-      <w:r>
-        <w:rPr>
-          <w:rFonts w:cstheme="minorHAnsi"/>
-        </w:rPr>
-        <w:t> — Family statistics: total/watched/unwatched movies, average rating, top genre, restricted count.</w:t>
-      </w:r>
-    </w:p>
-    <w:p>
-      <w:pPr>
-        <w:numPr>
-          <w:ilvl w:val="0"/>
-          <w:numId w:val="23"/>
-        </w:numPr>
-        <w:spacing w:before="120" w:after="120" w:line="240" w:lineRule="auto"/>
-        <w:jc w:val="both"/>
-        <w:rPr>
-          <w:rFonts w:cstheme="minorHAnsi"/>
-        </w:rPr>
-      </w:pPr>
-      <w:r>
-        <w:rPr>
-          <w:rFonts w:cstheme="minorHAnsi"/>
-          <w:b/>
-          <w:bCs/>
-        </w:rPr>
-        <w:t>Type2MainFrame – Movies tab / Watchlist / Progress</w:t>
-      </w:r>
-      <w:r>
-        <w:rPr>
-          <w:rFonts w:cstheme="minorHAnsi"/>
-        </w:rPr>
-        <w:t> — Child's restricted browsing view, personal watchlist, and progress summary.</w:t>
-      </w:r>
-    </w:p>
-    <w:p>
-      <w:pPr>
-        <w:numPr>
-          <w:ilvl w:val="0"/>
-          <w:numId w:val="23"/>
-        </w:numPr>
-        <w:spacing w:before="120" w:after="120" w:line="240" w:lineRule="auto"/>
-        <w:jc w:val="both"/>
-        <w:rPr>
-          <w:rFonts w:cstheme="minorHAnsi"/>
-        </w:rPr>
-      </w:pPr>
-      <w:r>
-        <w:rPr>
-          <w:rFonts w:cstheme="minorHAnsi"/>
-          <w:b/>
-          <w:bCs/>
-        </w:rPr>
-        <w:t>MovieEditDialog / UserEditDialog / RateDialog</w:t>
-      </w:r>
-      <w:r>
-        <w:rPr>
-          <w:rFonts w:cstheme="minorHAnsi"/>
-        </w:rPr>
-        <w:t> — Modal forms for adding/editing entries and rating movies.</w:t>
-      </w:r>
-    </w:p>
-    <w:p>
-      <w:pPr>
-        <w:spacing w:before="120" w:after="120" w:line="240" w:lineRule="auto"/>
-        <w:jc w:val="both"/>
-        <w:rPr>
-          <w:rFonts w:cstheme="minorHAnsi"/>
-        </w:rPr>
-      </w:pPr>
-    </w:p>
-    <w:p>
-      <w:pPr>
-        <w:pStyle w:val="Heading1"/>
         <w:spacing w:after="240" w:line="240" w:lineRule="auto"/>
         <w:rPr>
           <w:rFonts w:asciiTheme="minorHAnsi" w:hAnsiTheme="minorHAnsi" w:cstheme="minorHAnsi"/>
@@ -7923,7 +7396,6 @@
           <w:szCs w:val="28"/>
         </w:rPr>
       </w:pPr>
-      <w:bookmarkStart w:id="24" w:name="_Toc165838031"/>
       <w:r>
         <w:rPr>
           <w:rFonts w:asciiTheme="minorHAnsi" w:hAnsiTheme="minorHAnsi" w:cstheme="minorHAnsi"/>
@@ -7932,7 +7404,7 @@
           <w:sz w:val="28"/>
           <w:szCs w:val="28"/>
         </w:rPr>
-        <w:t>Conclusion</w:t>
+        <w:t xml:space="preserve">7.1 </w:t>
       </w:r>
       <w:r>
         <w:rPr>
@@ -7942,6 +7414,1217 @@
           <w:sz w:val="28"/>
           <w:szCs w:val="28"/>
         </w:rPr>
+        <w:t>Authentication</w:t>
+      </w:r>
+    </w:p>
+    <w:p>
+      <w:pPr>
+        <w:spacing w:before="120" w:after="120" w:line="240" w:lineRule="auto"/>
+        <w:jc w:val="both"/>
+        <w:rPr>
+          <w:rFonts w:cstheme="minorHAnsi"/>
+        </w:rPr>
+      </w:pPr>
+      <w:r>
+        <w:rPr>
+          <w:rFonts w:cstheme="minorHAnsi"/>
+        </w:rPr>
+        <w:t>1. LoginFrame — initial state</w:t>
+      </w:r>
+    </w:p>
+    <w:p>
+      <w:pPr>
+        <w:spacing w:before="120" w:after="120" w:line="240" w:lineRule="auto"/>
+        <w:jc w:val="both"/>
+        <w:rPr>
+          <w:rFonts w:cstheme="minorHAnsi"/>
+        </w:rPr>
+      </w:pPr>
+      <w:r>
+        <w:rPr>
+          <w:rFonts w:cstheme="minorHAnsi"/>
+        </w:rPr>
+        <w:lastRenderedPageBreak/>
+        <w:drawing>
+          <wp:inline distT="0" distB="0" distL="0" distR="0" wp14:anchorId="31423C98" wp14:editId="0B1EC4EC">
+            <wp:extent cx="5943600" cy="3342005"/>
+            <wp:effectExtent l="0" t="0" r="0" b="0"/>
+            <wp:docPr id="545385814" name="Picture 1"/>
+            <wp:cNvGraphicFramePr>
+              <a:graphicFrameLocks xmlns:a="http://schemas.openxmlformats.org/drawingml/2006/main" noChangeAspect="1"/>
+            </wp:cNvGraphicFramePr>
+            <a:graphic xmlns:a="http://schemas.openxmlformats.org/drawingml/2006/main">
+              <a:graphicData uri="http://schemas.openxmlformats.org/drawingml/2006/picture">
+                <pic:pic xmlns:pic="http://schemas.openxmlformats.org/drawingml/2006/picture">
+                  <pic:nvPicPr>
+                    <pic:cNvPr id="545385814" name=""/>
+                    <pic:cNvPicPr/>
+                  </pic:nvPicPr>
+                  <pic:blipFill>
+                    <a:blip r:embed="rId15"/>
+                    <a:stretch>
+                      <a:fillRect/>
+                    </a:stretch>
+                  </pic:blipFill>
+                  <pic:spPr>
+                    <a:xfrm>
+                      <a:off x="0" y="0"/>
+                      <a:ext cx="5943600" cy="3342005"/>
+                    </a:xfrm>
+                    <a:prstGeom prst="rect">
+                      <a:avLst/>
+                    </a:prstGeom>
+                  </pic:spPr>
+                </pic:pic>
+              </a:graphicData>
+            </a:graphic>
+          </wp:inline>
+        </w:drawing>
+      </w:r>
+    </w:p>
+    <w:p>
+      <w:pPr>
+        <w:spacing w:before="120" w:after="120" w:line="240" w:lineRule="auto"/>
+        <w:jc w:val="both"/>
+        <w:rPr>
+          <w:rFonts w:cstheme="minorHAnsi"/>
+        </w:rPr>
+      </w:pPr>
+    </w:p>
+    <w:p>
+      <w:pPr>
+        <w:spacing w:before="120" w:after="120" w:line="240" w:lineRule="auto"/>
+        <w:jc w:val="both"/>
+        <w:rPr>
+          <w:rFonts w:cstheme="minorHAnsi"/>
+        </w:rPr>
+      </w:pPr>
+      <w:r>
+        <w:rPr>
+          <w:rFonts w:cstheme="minorHAnsi"/>
+        </w:rPr>
+        <w:t>2. LoginFrame — invalid login error</w:t>
+      </w:r>
+    </w:p>
+    <w:p>
+      <w:pPr>
+        <w:spacing w:before="120" w:after="120" w:line="240" w:lineRule="auto"/>
+        <w:jc w:val="both"/>
+        <w:rPr>
+          <w:rFonts w:cstheme="minorHAnsi"/>
+        </w:rPr>
+      </w:pPr>
+      <w:r>
+        <w:rPr>
+          <w:rFonts w:cstheme="minorHAnsi"/>
+        </w:rPr>
+        <w:drawing>
+          <wp:inline distT="0" distB="0" distL="0" distR="0" wp14:anchorId="3B2A7C3C" wp14:editId="7544ECA0">
+            <wp:extent cx="5943600" cy="3342005"/>
+            <wp:effectExtent l="0" t="0" r="0" b="0"/>
+            <wp:docPr id="195926393" name="Picture 1"/>
+            <wp:cNvGraphicFramePr>
+              <a:graphicFrameLocks xmlns:a="http://schemas.openxmlformats.org/drawingml/2006/main" noChangeAspect="1"/>
+            </wp:cNvGraphicFramePr>
+            <a:graphic xmlns:a="http://schemas.openxmlformats.org/drawingml/2006/main">
+              <a:graphicData uri="http://schemas.openxmlformats.org/drawingml/2006/picture">
+                <pic:pic xmlns:pic="http://schemas.openxmlformats.org/drawingml/2006/picture">
+                  <pic:nvPicPr>
+                    <pic:cNvPr id="195926393" name=""/>
+                    <pic:cNvPicPr/>
+                  </pic:nvPicPr>
+                  <pic:blipFill>
+                    <a:blip r:embed="rId16"/>
+                    <a:stretch>
+                      <a:fillRect/>
+                    </a:stretch>
+                  </pic:blipFill>
+                  <pic:spPr>
+                    <a:xfrm>
+                      <a:off x="0" y="0"/>
+                      <a:ext cx="5943600" cy="3342005"/>
+                    </a:xfrm>
+                    <a:prstGeom prst="rect">
+                      <a:avLst/>
+                    </a:prstGeom>
+                  </pic:spPr>
+                </pic:pic>
+              </a:graphicData>
+            </a:graphic>
+          </wp:inline>
+        </w:drawing>
+      </w:r>
+    </w:p>
+    <w:p>
+      <w:pPr>
+        <w:pStyle w:val="Heading1"/>
+        <w:numPr>
+          <w:ilvl w:val="0"/>
+          <w:numId w:val="0"/>
+        </w:numPr>
+        <w:spacing w:after="240" w:line="240" w:lineRule="auto"/>
+        <w:rPr>
+          <w:rFonts w:cstheme="minorHAnsi"/>
+        </w:rPr>
+      </w:pPr>
+      <w:r>
+        <w:rPr>
+          <w:rFonts w:asciiTheme="minorHAnsi" w:hAnsiTheme="minorHAnsi" w:cstheme="minorHAnsi"/>
+          <w:b/>
+          <w:color w:val="0070C0"/>
+          <w:sz w:val="28"/>
+          <w:szCs w:val="28"/>
+        </w:rPr>
+        <w:t>7.</w:t>
+      </w:r>
+      <w:r>
+        <w:rPr>
+          <w:rFonts w:asciiTheme="minorHAnsi" w:hAnsiTheme="minorHAnsi" w:cstheme="minorHAnsi"/>
+          <w:b/>
+          <w:color w:val="0070C0"/>
+          <w:sz w:val="28"/>
+          <w:szCs w:val="28"/>
+        </w:rPr>
+        <w:t>2</w:t>
+      </w:r>
+      <w:r>
+        <w:rPr>
+          <w:rFonts w:cstheme="minorHAnsi"/>
+        </w:rPr>
+        <w:t xml:space="preserve"> </w:t>
+      </w:r>
+      <w:r>
+        <w:rPr>
+          <w:rFonts w:cstheme="minorHAnsi"/>
+        </w:rPr>
+        <w:t>Parent dashboard (Type1MainFrame)</w:t>
+      </w:r>
+    </w:p>
+    <w:p>
+      <w:pPr>
+        <w:spacing w:before="120" w:after="120" w:line="240" w:lineRule="auto"/>
+        <w:jc w:val="both"/>
+        <w:rPr>
+          <w:rFonts w:cstheme="minorHAnsi"/>
+        </w:rPr>
+      </w:pPr>
+      <w:r>
+        <w:rPr>
+          <w:rFonts w:cstheme="minorHAnsi"/>
+        </w:rPr>
+        <w:t>3. Type1MainFrame — Movies tab</w:t>
+      </w:r>
+    </w:p>
+    <w:p>
+      <w:pPr>
+        <w:spacing w:before="120" w:after="120" w:line="240" w:lineRule="auto"/>
+        <w:jc w:val="both"/>
+        <w:rPr>
+          <w:rFonts w:cstheme="minorHAnsi"/>
+        </w:rPr>
+      </w:pPr>
+    </w:p>
+    <w:p>
+      <w:pPr>
+        <w:spacing w:before="120" w:after="120" w:line="240" w:lineRule="auto"/>
+        <w:jc w:val="both"/>
+        <w:rPr>
+          <w:rFonts w:cstheme="minorHAnsi"/>
+        </w:rPr>
+      </w:pPr>
+      <w:r>
+        <w:rPr>
+          <w:rFonts w:cstheme="minorHAnsi"/>
+        </w:rPr>
+        <w:lastRenderedPageBreak/>
+        <w:drawing>
+          <wp:inline distT="0" distB="0" distL="0" distR="0" wp14:anchorId="5ABAD1A5" wp14:editId="740FFB3E">
+            <wp:extent cx="5943600" cy="3342005"/>
+            <wp:effectExtent l="0" t="0" r="0" b="0"/>
+            <wp:docPr id="482227068" name="Picture 1"/>
+            <wp:cNvGraphicFramePr>
+              <a:graphicFrameLocks xmlns:a="http://schemas.openxmlformats.org/drawingml/2006/main" noChangeAspect="1"/>
+            </wp:cNvGraphicFramePr>
+            <a:graphic xmlns:a="http://schemas.openxmlformats.org/drawingml/2006/main">
+              <a:graphicData uri="http://schemas.openxmlformats.org/drawingml/2006/picture">
+                <pic:pic xmlns:pic="http://schemas.openxmlformats.org/drawingml/2006/picture">
+                  <pic:nvPicPr>
+                    <pic:cNvPr id="482227068" name=""/>
+                    <pic:cNvPicPr/>
+                  </pic:nvPicPr>
+                  <pic:blipFill>
+                    <a:blip r:embed="rId17"/>
+                    <a:stretch>
+                      <a:fillRect/>
+                    </a:stretch>
+                  </pic:blipFill>
+                  <pic:spPr>
+                    <a:xfrm>
+                      <a:off x="0" y="0"/>
+                      <a:ext cx="5943600" cy="3342005"/>
+                    </a:xfrm>
+                    <a:prstGeom prst="rect">
+                      <a:avLst/>
+                    </a:prstGeom>
+                  </pic:spPr>
+                </pic:pic>
+              </a:graphicData>
+            </a:graphic>
+          </wp:inline>
+        </w:drawing>
+      </w:r>
+    </w:p>
+    <w:p>
+      <w:pPr>
+        <w:spacing w:before="120" w:after="120" w:line="240" w:lineRule="auto"/>
+        <w:jc w:val="both"/>
+        <w:rPr>
+          <w:rFonts w:cstheme="minorHAnsi"/>
+        </w:rPr>
+      </w:pPr>
+    </w:p>
+    <w:p>
+      <w:pPr>
+        <w:spacing w:before="120" w:after="120" w:line="240" w:lineRule="auto"/>
+        <w:jc w:val="both"/>
+        <w:rPr>
+          <w:rFonts w:cstheme="minorHAnsi"/>
+        </w:rPr>
+      </w:pPr>
+      <w:r>
+        <w:rPr>
+          <w:rFonts w:cstheme="minorHAnsi"/>
+        </w:rPr>
+        <w:t>4. Browse / Filter in action (function 12)</w:t>
+      </w:r>
+    </w:p>
+    <w:p>
+      <w:pPr>
+        <w:spacing w:before="120" w:after="120" w:line="240" w:lineRule="auto"/>
+        <w:jc w:val="both"/>
+        <w:rPr>
+          <w:rFonts w:cstheme="minorHAnsi"/>
+        </w:rPr>
+      </w:pPr>
+      <w:r>
+        <w:rPr>
+          <w:rFonts w:cstheme="minorHAnsi"/>
+        </w:rPr>
+        <w:drawing>
+          <wp:inline distT="0" distB="0" distL="0" distR="0" wp14:anchorId="5368AD18" wp14:editId="114EABFF">
+            <wp:extent cx="5943600" cy="3342005"/>
+            <wp:effectExtent l="0" t="0" r="0" b="0"/>
+            <wp:docPr id="2021564575" name="Picture 1"/>
+            <wp:cNvGraphicFramePr>
+              <a:graphicFrameLocks xmlns:a="http://schemas.openxmlformats.org/drawingml/2006/main" noChangeAspect="1"/>
+            </wp:cNvGraphicFramePr>
+            <a:graphic xmlns:a="http://schemas.openxmlformats.org/drawingml/2006/main">
+              <a:graphicData uri="http://schemas.openxmlformats.org/drawingml/2006/picture">
+                <pic:pic xmlns:pic="http://schemas.openxmlformats.org/drawingml/2006/picture">
+                  <pic:nvPicPr>
+                    <pic:cNvPr id="2021564575" name=""/>
+                    <pic:cNvPicPr/>
+                  </pic:nvPicPr>
+                  <pic:blipFill>
+                    <a:blip r:embed="rId18"/>
+                    <a:stretch>
+                      <a:fillRect/>
+                    </a:stretch>
+                  </pic:blipFill>
+                  <pic:spPr>
+                    <a:xfrm>
+                      <a:off x="0" y="0"/>
+                      <a:ext cx="5943600" cy="3342005"/>
+                    </a:xfrm>
+                    <a:prstGeom prst="rect">
+                      <a:avLst/>
+                    </a:prstGeom>
+                  </pic:spPr>
+                </pic:pic>
+              </a:graphicData>
+            </a:graphic>
+          </wp:inline>
+        </w:drawing>
+      </w:r>
+    </w:p>
+    <w:p>
+      <w:pPr>
+        <w:spacing w:before="120" w:after="120" w:line="240" w:lineRule="auto"/>
+        <w:jc w:val="both"/>
+        <w:rPr>
+          <w:rFonts w:cstheme="minorHAnsi"/>
+        </w:rPr>
+      </w:pPr>
+    </w:p>
+    <w:p>
+      <w:pPr>
+        <w:spacing w:before="120" w:after="120" w:line="240" w:lineRule="auto"/>
+        <w:jc w:val="both"/>
+        <w:rPr>
+          <w:rFonts w:cstheme="minorHAnsi"/>
+        </w:rPr>
+      </w:pPr>
+      <w:r>
+        <w:rPr>
+          <w:rFonts w:cstheme="minorHAnsi"/>
+        </w:rPr>
+        <w:t>5. MovieEditDialog — Add mode (functions 1, 4)</w:t>
+      </w:r>
+    </w:p>
+    <w:p>
+      <w:pPr>
+        <w:spacing w:before="120" w:after="120" w:line="240" w:lineRule="auto"/>
+        <w:jc w:val="both"/>
+        <w:rPr>
+          <w:rFonts w:cstheme="minorHAnsi"/>
+        </w:rPr>
+      </w:pPr>
+      <w:r>
+        <w:rPr>
+          <w:rFonts w:cstheme="minorHAnsi"/>
+        </w:rPr>
+        <w:lastRenderedPageBreak/>
+        <w:drawing>
+          <wp:inline distT="0" distB="0" distL="0" distR="0" wp14:anchorId="4B1B8D82" wp14:editId="06637E85">
+            <wp:extent cx="5943600" cy="3342005"/>
+            <wp:effectExtent l="0" t="0" r="0" b="0"/>
+            <wp:docPr id="1201747469" name="Picture 1"/>
+            <wp:cNvGraphicFramePr>
+              <a:graphicFrameLocks xmlns:a="http://schemas.openxmlformats.org/drawingml/2006/main" noChangeAspect="1"/>
+            </wp:cNvGraphicFramePr>
+            <a:graphic xmlns:a="http://schemas.openxmlformats.org/drawingml/2006/main">
+              <a:graphicData uri="http://schemas.openxmlformats.org/drawingml/2006/picture">
+                <pic:pic xmlns:pic="http://schemas.openxmlformats.org/drawingml/2006/picture">
+                  <pic:nvPicPr>
+                    <pic:cNvPr id="1201747469" name=""/>
+                    <pic:cNvPicPr/>
+                  </pic:nvPicPr>
+                  <pic:blipFill>
+                    <a:blip r:embed="rId19"/>
+                    <a:stretch>
+                      <a:fillRect/>
+                    </a:stretch>
+                  </pic:blipFill>
+                  <pic:spPr>
+                    <a:xfrm>
+                      <a:off x="0" y="0"/>
+                      <a:ext cx="5943600" cy="3342005"/>
+                    </a:xfrm>
+                    <a:prstGeom prst="rect">
+                      <a:avLst/>
+                    </a:prstGeom>
+                  </pic:spPr>
+                </pic:pic>
+              </a:graphicData>
+            </a:graphic>
+          </wp:inline>
+        </w:drawing>
+      </w:r>
+    </w:p>
+    <w:p>
+      <w:pPr>
+        <w:spacing w:before="120" w:after="120" w:line="240" w:lineRule="auto"/>
+        <w:jc w:val="both"/>
+        <w:rPr>
+          <w:rFonts w:cstheme="minorHAnsi"/>
+        </w:rPr>
+      </w:pPr>
+    </w:p>
+    <w:p>
+      <w:pPr>
+        <w:spacing w:before="120" w:after="120" w:line="240" w:lineRule="auto"/>
+        <w:jc w:val="both"/>
+        <w:rPr>
+          <w:rFonts w:cstheme="minorHAnsi"/>
+        </w:rPr>
+      </w:pPr>
+      <w:r>
+        <w:rPr>
+          <w:rFonts w:cstheme="minorHAnsi"/>
+        </w:rPr>
+        <w:t>6. MovieEditDialog — Edit mode (function 2)</w:t>
+      </w:r>
+    </w:p>
+    <w:p>
+      <w:pPr>
+        <w:spacing w:before="120" w:after="120" w:line="240" w:lineRule="auto"/>
+        <w:jc w:val="both"/>
+        <w:rPr>
+          <w:rFonts w:cstheme="minorHAnsi"/>
+        </w:rPr>
+      </w:pPr>
+      <w:r>
+        <w:rPr>
+          <w:rFonts w:cstheme="minorHAnsi"/>
+        </w:rPr>
+        <w:drawing>
+          <wp:inline distT="0" distB="0" distL="0" distR="0" wp14:anchorId="13BD44D2" wp14:editId="79C0FDEA">
+            <wp:extent cx="5943600" cy="3342005"/>
+            <wp:effectExtent l="0" t="0" r="0" b="0"/>
+            <wp:docPr id="518561786" name="Picture 1"/>
+            <wp:cNvGraphicFramePr>
+              <a:graphicFrameLocks xmlns:a="http://schemas.openxmlformats.org/drawingml/2006/main" noChangeAspect="1"/>
+            </wp:cNvGraphicFramePr>
+            <a:graphic xmlns:a="http://schemas.openxmlformats.org/drawingml/2006/main">
+              <a:graphicData uri="http://schemas.openxmlformats.org/drawingml/2006/picture">
+                <pic:pic xmlns:pic="http://schemas.openxmlformats.org/drawingml/2006/picture">
+                  <pic:nvPicPr>
+                    <pic:cNvPr id="518561786" name=""/>
+                    <pic:cNvPicPr/>
+                  </pic:nvPicPr>
+                  <pic:blipFill>
+                    <a:blip r:embed="rId20"/>
+                    <a:stretch>
+                      <a:fillRect/>
+                    </a:stretch>
+                  </pic:blipFill>
+                  <pic:spPr>
+                    <a:xfrm>
+                      <a:off x="0" y="0"/>
+                      <a:ext cx="5943600" cy="3342005"/>
+                    </a:xfrm>
+                    <a:prstGeom prst="rect">
+                      <a:avLst/>
+                    </a:prstGeom>
+                  </pic:spPr>
+                </pic:pic>
+              </a:graphicData>
+            </a:graphic>
+          </wp:inline>
+        </w:drawing>
+      </w:r>
+    </w:p>
+    <w:p>
+      <w:pPr>
+        <w:spacing w:before="120" w:after="120" w:line="240" w:lineRule="auto"/>
+        <w:jc w:val="both"/>
+        <w:rPr>
+          <w:rFonts w:cstheme="minorHAnsi"/>
+        </w:rPr>
+      </w:pPr>
+    </w:p>
+    <w:p>
+      <w:pPr>
+        <w:spacing w:before="120" w:after="120" w:line="240" w:lineRule="auto"/>
+        <w:jc w:val="both"/>
+        <w:rPr>
+          <w:rFonts w:cstheme="minorHAnsi"/>
+        </w:rPr>
+      </w:pPr>
+      <w:r>
+        <w:rPr>
+          <w:rFonts w:cstheme="minorHAnsi"/>
+        </w:rPr>
+        <w:t>7. Type1MainFrame — Accounts tab (function 3)</w:t>
+      </w:r>
+    </w:p>
+    <w:p>
+      <w:pPr>
+        <w:spacing w:before="120" w:after="120" w:line="240" w:lineRule="auto"/>
+        <w:jc w:val="both"/>
+        <w:rPr>
+          <w:rFonts w:cstheme="minorHAnsi"/>
+        </w:rPr>
+      </w:pPr>
+      <w:r>
+        <w:rPr>
+          <w:rFonts w:cstheme="minorHAnsi"/>
+        </w:rPr>
+        <w:lastRenderedPageBreak/>
+        <w:drawing>
+          <wp:inline distT="0" distB="0" distL="0" distR="0" wp14:anchorId="24997D91" wp14:editId="2A5B5714">
+            <wp:extent cx="5943600" cy="3342005"/>
+            <wp:effectExtent l="0" t="0" r="0" b="0"/>
+            <wp:docPr id="1776085679" name="Picture 1"/>
+            <wp:cNvGraphicFramePr>
+              <a:graphicFrameLocks xmlns:a="http://schemas.openxmlformats.org/drawingml/2006/main" noChangeAspect="1"/>
+            </wp:cNvGraphicFramePr>
+            <a:graphic xmlns:a="http://schemas.openxmlformats.org/drawingml/2006/main">
+              <a:graphicData uri="http://schemas.openxmlformats.org/drawingml/2006/picture">
+                <pic:pic xmlns:pic="http://schemas.openxmlformats.org/drawingml/2006/picture">
+                  <pic:nvPicPr>
+                    <pic:cNvPr id="1776085679" name=""/>
+                    <pic:cNvPicPr/>
+                  </pic:nvPicPr>
+                  <pic:blipFill>
+                    <a:blip r:embed="rId21"/>
+                    <a:stretch>
+                      <a:fillRect/>
+                    </a:stretch>
+                  </pic:blipFill>
+                  <pic:spPr>
+                    <a:xfrm>
+                      <a:off x="0" y="0"/>
+                      <a:ext cx="5943600" cy="3342005"/>
+                    </a:xfrm>
+                    <a:prstGeom prst="rect">
+                      <a:avLst/>
+                    </a:prstGeom>
+                  </pic:spPr>
+                </pic:pic>
+              </a:graphicData>
+            </a:graphic>
+          </wp:inline>
+        </w:drawing>
+      </w:r>
+    </w:p>
+    <w:p>
+      <w:pPr>
+        <w:spacing w:before="120" w:after="120" w:line="240" w:lineRule="auto"/>
+        <w:jc w:val="both"/>
+        <w:rPr>
+          <w:rFonts w:cstheme="minorHAnsi"/>
+        </w:rPr>
+      </w:pPr>
+    </w:p>
+    <w:p>
+      <w:pPr>
+        <w:spacing w:before="120" w:after="120" w:line="240" w:lineRule="auto"/>
+        <w:jc w:val="both"/>
+        <w:rPr>
+          <w:rFonts w:cstheme="minorHAnsi"/>
+        </w:rPr>
+      </w:pPr>
+      <w:r>
+        <w:rPr>
+          <w:rFonts w:cstheme="minorHAnsi"/>
+        </w:rPr>
+        <w:t>8. UserEditDialog</w:t>
+      </w:r>
+    </w:p>
+    <w:p>
+      <w:pPr>
+        <w:spacing w:before="120" w:after="120" w:line="240" w:lineRule="auto"/>
+        <w:jc w:val="both"/>
+        <w:rPr>
+          <w:rFonts w:cstheme="minorHAnsi"/>
+        </w:rPr>
+      </w:pPr>
+      <w:r>
+        <w:rPr>
+          <w:rFonts w:cstheme="minorHAnsi"/>
+        </w:rPr>
+        <w:drawing>
+          <wp:inline distT="0" distB="0" distL="0" distR="0" wp14:anchorId="7B6148D2" wp14:editId="4BC0176F">
+            <wp:extent cx="5943600" cy="3342005"/>
+            <wp:effectExtent l="0" t="0" r="0" b="0"/>
+            <wp:docPr id="1252548724" name="Picture 1"/>
+            <wp:cNvGraphicFramePr>
+              <a:graphicFrameLocks xmlns:a="http://schemas.openxmlformats.org/drawingml/2006/main" noChangeAspect="1"/>
+            </wp:cNvGraphicFramePr>
+            <a:graphic xmlns:a="http://schemas.openxmlformats.org/drawingml/2006/main">
+              <a:graphicData uri="http://schemas.openxmlformats.org/drawingml/2006/picture">
+                <pic:pic xmlns:pic="http://schemas.openxmlformats.org/drawingml/2006/picture">
+                  <pic:nvPicPr>
+                    <pic:cNvPr id="1252548724" name=""/>
+                    <pic:cNvPicPr/>
+                  </pic:nvPicPr>
+                  <pic:blipFill>
+                    <a:blip r:embed="rId22"/>
+                    <a:stretch>
+                      <a:fillRect/>
+                    </a:stretch>
+                  </pic:blipFill>
+                  <pic:spPr>
+                    <a:xfrm>
+                      <a:off x="0" y="0"/>
+                      <a:ext cx="5943600" cy="3342005"/>
+                    </a:xfrm>
+                    <a:prstGeom prst="rect">
+                      <a:avLst/>
+                    </a:prstGeom>
+                  </pic:spPr>
+                </pic:pic>
+              </a:graphicData>
+            </a:graphic>
+          </wp:inline>
+        </w:drawing>
+      </w:r>
+    </w:p>
+    <w:p>
+      <w:pPr>
+        <w:spacing w:before="120" w:after="120" w:line="240" w:lineRule="auto"/>
+        <w:jc w:val="both"/>
+        <w:rPr>
+          <w:rFonts w:cstheme="minorHAnsi"/>
+        </w:rPr>
+      </w:pPr>
+    </w:p>
+    <w:p>
+      <w:pPr>
+        <w:spacing w:before="120" w:after="120" w:line="240" w:lineRule="auto"/>
+        <w:jc w:val="both"/>
+        <w:rPr>
+          <w:rFonts w:cstheme="minorHAnsi"/>
+        </w:rPr>
+      </w:pPr>
+      <w:r>
+        <w:rPr>
+          <w:rFonts w:cstheme="minorHAnsi"/>
+        </w:rPr>
+        <w:t>9. Type1MainFrame — Analytics tab (function 6)</w:t>
+      </w:r>
+    </w:p>
+    <w:p>
+      <w:pPr>
+        <w:spacing w:before="120" w:after="120" w:line="240" w:lineRule="auto"/>
+        <w:jc w:val="both"/>
+        <w:rPr>
+          <w:rFonts w:cstheme="minorHAnsi"/>
+        </w:rPr>
+      </w:pPr>
+      <w:r>
+        <w:rPr>
+          <w:rFonts w:cstheme="minorHAnsi"/>
+        </w:rPr>
+        <w:lastRenderedPageBreak/>
+        <w:drawing>
+          <wp:inline distT="0" distB="0" distL="0" distR="0" wp14:anchorId="6B669FFE" wp14:editId="45BCA78B">
+            <wp:extent cx="5943600" cy="3342005"/>
+            <wp:effectExtent l="0" t="0" r="0" b="0"/>
+            <wp:docPr id="1890752908" name="Picture 1"/>
+            <wp:cNvGraphicFramePr>
+              <a:graphicFrameLocks xmlns:a="http://schemas.openxmlformats.org/drawingml/2006/main" noChangeAspect="1"/>
+            </wp:cNvGraphicFramePr>
+            <a:graphic xmlns:a="http://schemas.openxmlformats.org/drawingml/2006/main">
+              <a:graphicData uri="http://schemas.openxmlformats.org/drawingml/2006/picture">
+                <pic:pic xmlns:pic="http://schemas.openxmlformats.org/drawingml/2006/picture">
+                  <pic:nvPicPr>
+                    <pic:cNvPr id="1890752908" name=""/>
+                    <pic:cNvPicPr/>
+                  </pic:nvPicPr>
+                  <pic:blipFill>
+                    <a:blip r:embed="rId23"/>
+                    <a:stretch>
+                      <a:fillRect/>
+                    </a:stretch>
+                  </pic:blipFill>
+                  <pic:spPr>
+                    <a:xfrm>
+                      <a:off x="0" y="0"/>
+                      <a:ext cx="5943600" cy="3342005"/>
+                    </a:xfrm>
+                    <a:prstGeom prst="rect">
+                      <a:avLst/>
+                    </a:prstGeom>
+                  </pic:spPr>
+                </pic:pic>
+              </a:graphicData>
+            </a:graphic>
+          </wp:inline>
+        </w:drawing>
+      </w:r>
+    </w:p>
+    <w:p>
+      <w:pPr>
+        <w:spacing w:before="120" w:after="120" w:line="240" w:lineRule="auto"/>
+        <w:jc w:val="both"/>
+        <w:rPr>
+          <w:rFonts w:cstheme="minorHAnsi"/>
+        </w:rPr>
+      </w:pPr>
+    </w:p>
+    <w:p>
+      <w:pPr>
+        <w:spacing w:before="120" w:after="120" w:line="240" w:lineRule="auto"/>
+        <w:jc w:val="both"/>
+        <w:rPr>
+          <w:rFonts w:cstheme="minorHAnsi"/>
+        </w:rPr>
+      </w:pPr>
+      <w:r>
+        <w:rPr>
+          <w:rFonts w:cstheme="minorHAnsi"/>
+        </w:rPr>
+        <w:t>10. Movie detail dialog — Parent view with Moderate (functions 5, 13)</w:t>
+      </w:r>
+    </w:p>
+    <w:p>
+      <w:pPr>
+        <w:spacing w:before="120" w:after="120" w:line="240" w:lineRule="auto"/>
+        <w:jc w:val="both"/>
+        <w:rPr>
+          <w:rFonts w:cstheme="minorHAnsi"/>
+        </w:rPr>
+      </w:pPr>
+      <w:r>
+        <w:rPr>
+          <w:rFonts w:cstheme="minorHAnsi"/>
+        </w:rPr>
+        <w:drawing>
+          <wp:inline distT="0" distB="0" distL="0" distR="0" wp14:anchorId="00662B15" wp14:editId="08450AB3">
+            <wp:extent cx="5943600" cy="3342005"/>
+            <wp:effectExtent l="0" t="0" r="0" b="0"/>
+            <wp:docPr id="1220774122" name="Picture 1"/>
+            <wp:cNvGraphicFramePr>
+              <a:graphicFrameLocks xmlns:a="http://schemas.openxmlformats.org/drawingml/2006/main" noChangeAspect="1"/>
+            </wp:cNvGraphicFramePr>
+            <a:graphic xmlns:a="http://schemas.openxmlformats.org/drawingml/2006/main">
+              <a:graphicData uri="http://schemas.openxmlformats.org/drawingml/2006/picture">
+                <pic:pic xmlns:pic="http://schemas.openxmlformats.org/drawingml/2006/picture">
+                  <pic:nvPicPr>
+                    <pic:cNvPr id="1220774122" name=""/>
+                    <pic:cNvPicPr/>
+                  </pic:nvPicPr>
+                  <pic:blipFill>
+                    <a:blip r:embed="rId24"/>
+                    <a:stretch>
+                      <a:fillRect/>
+                    </a:stretch>
+                  </pic:blipFill>
+                  <pic:spPr>
+                    <a:xfrm>
+                      <a:off x="0" y="0"/>
+                      <a:ext cx="5943600" cy="3342005"/>
+                    </a:xfrm>
+                    <a:prstGeom prst="rect">
+                      <a:avLst/>
+                    </a:prstGeom>
+                  </pic:spPr>
+                </pic:pic>
+              </a:graphicData>
+            </a:graphic>
+          </wp:inline>
+        </w:drawing>
+      </w:r>
+    </w:p>
+    <w:p>
+      <w:pPr>
+        <w:spacing w:before="120" w:after="120" w:line="240" w:lineRule="auto"/>
+        <w:jc w:val="both"/>
+        <w:rPr>
+          <w:rFonts w:cstheme="minorHAnsi"/>
+        </w:rPr>
+      </w:pPr>
+    </w:p>
+    <w:p>
+      <w:pPr>
+        <w:spacing w:before="120" w:after="120" w:line="240" w:lineRule="auto"/>
+        <w:jc w:val="both"/>
+        <w:rPr>
+          <w:rFonts w:cstheme="minorHAnsi"/>
+        </w:rPr>
+      </w:pPr>
+      <w:r>
+        <w:rPr>
+          <w:rFonts w:cstheme="minorHAnsi"/>
+          <w:b/>
+          <w:color w:val="0070C0"/>
+          <w:sz w:val="28"/>
+          <w:szCs w:val="28"/>
+        </w:rPr>
+        <w:t>7.</w:t>
+      </w:r>
+      <w:r>
+        <w:rPr>
+          <w:rFonts w:cstheme="minorHAnsi"/>
+          <w:b/>
+          <w:color w:val="0070C0"/>
+          <w:sz w:val="28"/>
+          <w:szCs w:val="28"/>
+        </w:rPr>
+        <w:t>3 Child Dashboard (Type2MainFrame)</w:t>
+      </w:r>
+    </w:p>
+    <w:p>
+      <w:pPr>
+        <w:spacing w:before="120" w:after="120" w:line="240" w:lineRule="auto"/>
+        <w:jc w:val="both"/>
+        <w:rPr>
+          <w:rFonts w:cstheme="minorHAnsi"/>
+        </w:rPr>
+      </w:pPr>
+      <w:r>
+        <w:rPr>
+          <w:rFonts w:cstheme="minorHAnsi"/>
+        </w:rPr>
+        <w:t>11. Type2MainFrame — Movies tab</w:t>
+      </w:r>
+    </w:p>
+    <w:p>
+      <w:pPr>
+        <w:spacing w:before="120" w:after="120" w:line="240" w:lineRule="auto"/>
+        <w:jc w:val="both"/>
+        <w:rPr>
+          <w:rFonts w:cstheme="minorHAnsi"/>
+        </w:rPr>
+      </w:pPr>
+      <w:r>
+        <w:rPr>
+          <w:rFonts w:cstheme="minorHAnsi"/>
+        </w:rPr>
+        <w:lastRenderedPageBreak/>
+        <w:drawing>
+          <wp:inline distT="0" distB="0" distL="0" distR="0" wp14:anchorId="1883ACD0" wp14:editId="08255E56">
+            <wp:extent cx="5943600" cy="3342005"/>
+            <wp:effectExtent l="0" t="0" r="0" b="0"/>
+            <wp:docPr id="171235716" name="Picture 1"/>
+            <wp:cNvGraphicFramePr>
+              <a:graphicFrameLocks xmlns:a="http://schemas.openxmlformats.org/drawingml/2006/main" noChangeAspect="1"/>
+            </wp:cNvGraphicFramePr>
+            <a:graphic xmlns:a="http://schemas.openxmlformats.org/drawingml/2006/main">
+              <a:graphicData uri="http://schemas.openxmlformats.org/drawingml/2006/picture">
+                <pic:pic xmlns:pic="http://schemas.openxmlformats.org/drawingml/2006/picture">
+                  <pic:nvPicPr>
+                    <pic:cNvPr id="171235716" name=""/>
+                    <pic:cNvPicPr/>
+                  </pic:nvPicPr>
+                  <pic:blipFill>
+                    <a:blip r:embed="rId25"/>
+                    <a:stretch>
+                      <a:fillRect/>
+                    </a:stretch>
+                  </pic:blipFill>
+                  <pic:spPr>
+                    <a:xfrm>
+                      <a:off x="0" y="0"/>
+                      <a:ext cx="5943600" cy="3342005"/>
+                    </a:xfrm>
+                    <a:prstGeom prst="rect">
+                      <a:avLst/>
+                    </a:prstGeom>
+                  </pic:spPr>
+                </pic:pic>
+              </a:graphicData>
+            </a:graphic>
+          </wp:inline>
+        </w:drawing>
+      </w:r>
+    </w:p>
+    <w:p>
+      <w:pPr>
+        <w:spacing w:before="120" w:after="120" w:line="240" w:lineRule="auto"/>
+        <w:jc w:val="both"/>
+        <w:rPr>
+          <w:rFonts w:cstheme="minorHAnsi"/>
+        </w:rPr>
+      </w:pPr>
+    </w:p>
+    <w:p>
+      <w:pPr>
+        <w:spacing w:before="120" w:after="120" w:line="240" w:lineRule="auto"/>
+        <w:jc w:val="both"/>
+        <w:rPr>
+          <w:rFonts w:cstheme="minorHAnsi"/>
+        </w:rPr>
+      </w:pPr>
+      <w:r>
+        <w:rPr>
+          <w:rFonts w:cstheme="minorHAnsi"/>
+        </w:rPr>
+        <w:t>12. Movie detail dialog — Child view (functions 7, 13)</w:t>
+      </w:r>
+    </w:p>
+    <w:p>
+      <w:pPr>
+        <w:spacing w:before="120" w:after="120" w:line="240" w:lineRule="auto"/>
+        <w:jc w:val="both"/>
+        <w:rPr>
+          <w:rFonts w:cstheme="minorHAnsi"/>
+        </w:rPr>
+      </w:pPr>
+      <w:r>
+        <w:rPr>
+          <w:rFonts w:cstheme="minorHAnsi"/>
+        </w:rPr>
+        <w:drawing>
+          <wp:inline distT="0" distB="0" distL="0" distR="0" wp14:anchorId="7635AC90" wp14:editId="256DFA17">
+            <wp:extent cx="5943600" cy="3342005"/>
+            <wp:effectExtent l="0" t="0" r="0" b="0"/>
+            <wp:docPr id="1857604320" name="Picture 1"/>
+            <wp:cNvGraphicFramePr>
+              <a:graphicFrameLocks xmlns:a="http://schemas.openxmlformats.org/drawingml/2006/main" noChangeAspect="1"/>
+            </wp:cNvGraphicFramePr>
+            <a:graphic xmlns:a="http://schemas.openxmlformats.org/drawingml/2006/main">
+              <a:graphicData uri="http://schemas.openxmlformats.org/drawingml/2006/picture">
+                <pic:pic xmlns:pic="http://schemas.openxmlformats.org/drawingml/2006/picture">
+                  <pic:nvPicPr>
+                    <pic:cNvPr id="1857604320" name=""/>
+                    <pic:cNvPicPr/>
+                  </pic:nvPicPr>
+                  <pic:blipFill>
+                    <a:blip r:embed="rId26"/>
+                    <a:stretch>
+                      <a:fillRect/>
+                    </a:stretch>
+                  </pic:blipFill>
+                  <pic:spPr>
+                    <a:xfrm>
+                      <a:off x="0" y="0"/>
+                      <a:ext cx="5943600" cy="3342005"/>
+                    </a:xfrm>
+                    <a:prstGeom prst="rect">
+                      <a:avLst/>
+                    </a:prstGeom>
+                  </pic:spPr>
+                </pic:pic>
+              </a:graphicData>
+            </a:graphic>
+          </wp:inline>
+        </w:drawing>
+      </w:r>
+    </w:p>
+    <w:p>
+      <w:pPr>
+        <w:spacing w:before="120" w:after="120" w:line="240" w:lineRule="auto"/>
+        <w:jc w:val="both"/>
+        <w:rPr>
+          <w:rFonts w:cstheme="minorHAnsi"/>
+        </w:rPr>
+      </w:pPr>
+    </w:p>
+    <w:p>
+      <w:pPr>
+        <w:spacing w:before="120" w:after="120" w:line="240" w:lineRule="auto"/>
+        <w:jc w:val="both"/>
+        <w:rPr>
+          <w:rFonts w:cstheme="minorHAnsi"/>
+        </w:rPr>
+      </w:pPr>
+      <w:r>
+        <w:rPr>
+          <w:rFonts w:cstheme="minorHAnsi"/>
+        </w:rPr>
+        <w:t>13. RateDialog (functions 8, 9)</w:t>
+      </w:r>
+    </w:p>
+    <w:p>
+      <w:pPr>
+        <w:spacing w:before="120" w:after="120" w:line="240" w:lineRule="auto"/>
+        <w:jc w:val="both"/>
+        <w:rPr>
+          <w:rFonts w:cstheme="minorHAnsi"/>
+        </w:rPr>
+      </w:pPr>
+    </w:p>
+    <w:p>
+      <w:pPr>
+        <w:spacing w:before="120" w:after="120" w:line="240" w:lineRule="auto"/>
+        <w:jc w:val="both"/>
+        <w:rPr>
+          <w:rFonts w:cstheme="minorHAnsi"/>
+        </w:rPr>
+      </w:pPr>
+      <w:r>
+        <w:rPr>
+          <w:rFonts w:cstheme="minorHAnsi"/>
+        </w:rPr>
+        <w:lastRenderedPageBreak/>
+        <w:drawing>
+          <wp:inline distT="0" distB="0" distL="0" distR="0" wp14:anchorId="5B21780F" wp14:editId="3CFBFBC3">
+            <wp:extent cx="5943600" cy="3335655"/>
+            <wp:effectExtent l="0" t="0" r="0" b="0"/>
+            <wp:docPr id="445275835" name="Picture 1"/>
+            <wp:cNvGraphicFramePr>
+              <a:graphicFrameLocks xmlns:a="http://schemas.openxmlformats.org/drawingml/2006/main" noChangeAspect="1"/>
+            </wp:cNvGraphicFramePr>
+            <a:graphic xmlns:a="http://schemas.openxmlformats.org/drawingml/2006/main">
+              <a:graphicData uri="http://schemas.openxmlformats.org/drawingml/2006/picture">
+                <pic:pic xmlns:pic="http://schemas.openxmlformats.org/drawingml/2006/picture">
+                  <pic:nvPicPr>
+                    <pic:cNvPr id="445275835" name=""/>
+                    <pic:cNvPicPr/>
+                  </pic:nvPicPr>
+                  <pic:blipFill>
+                    <a:blip r:embed="rId27"/>
+                    <a:stretch>
+                      <a:fillRect/>
+                    </a:stretch>
+                  </pic:blipFill>
+                  <pic:spPr>
+                    <a:xfrm>
+                      <a:off x="0" y="0"/>
+                      <a:ext cx="5943600" cy="3335655"/>
+                    </a:xfrm>
+                    <a:prstGeom prst="rect">
+                      <a:avLst/>
+                    </a:prstGeom>
+                  </pic:spPr>
+                </pic:pic>
+              </a:graphicData>
+            </a:graphic>
+          </wp:inline>
+        </w:drawing>
+      </w:r>
+    </w:p>
+    <w:p>
+      <w:pPr>
+        <w:spacing w:before="120" w:after="120" w:line="240" w:lineRule="auto"/>
+        <w:jc w:val="both"/>
+        <w:rPr>
+          <w:rFonts w:cstheme="minorHAnsi"/>
+        </w:rPr>
+      </w:pPr>
+    </w:p>
+    <w:p>
+      <w:pPr>
+        <w:spacing w:before="120" w:after="120" w:line="240" w:lineRule="auto"/>
+        <w:jc w:val="both"/>
+        <w:rPr>
+          <w:rFonts w:cstheme="minorHAnsi"/>
+        </w:rPr>
+      </w:pPr>
+      <w:r>
+        <w:rPr>
+          <w:rFonts w:cstheme="minorHAnsi"/>
+        </w:rPr>
+        <w:t>14. Type2MainFrame — Watchlist tab (function 10)</w:t>
+      </w:r>
+    </w:p>
+    <w:p>
+      <w:pPr>
+        <w:spacing w:before="120" w:after="120" w:line="240" w:lineRule="auto"/>
+        <w:jc w:val="both"/>
+        <w:rPr>
+          <w:rFonts w:cstheme="minorHAnsi"/>
+        </w:rPr>
+      </w:pPr>
+      <w:r>
+        <w:rPr>
+          <w:rFonts w:cstheme="minorHAnsi"/>
+        </w:rPr>
+        <w:drawing>
+          <wp:inline distT="0" distB="0" distL="0" distR="0" wp14:anchorId="1E8A3185" wp14:editId="7769C56B">
+            <wp:extent cx="5943600" cy="3342005"/>
+            <wp:effectExtent l="0" t="0" r="0" b="0"/>
+            <wp:docPr id="794240280" name="Picture 1"/>
+            <wp:cNvGraphicFramePr>
+              <a:graphicFrameLocks xmlns:a="http://schemas.openxmlformats.org/drawingml/2006/main" noChangeAspect="1"/>
+            </wp:cNvGraphicFramePr>
+            <a:graphic xmlns:a="http://schemas.openxmlformats.org/drawingml/2006/main">
+              <a:graphicData uri="http://schemas.openxmlformats.org/drawingml/2006/picture">
+                <pic:pic xmlns:pic="http://schemas.openxmlformats.org/drawingml/2006/picture">
+                  <pic:nvPicPr>
+                    <pic:cNvPr id="794240280" name=""/>
+                    <pic:cNvPicPr/>
+                  </pic:nvPicPr>
+                  <pic:blipFill>
+                    <a:blip r:embed="rId28"/>
+                    <a:stretch>
+                      <a:fillRect/>
+                    </a:stretch>
+                  </pic:blipFill>
+                  <pic:spPr>
+                    <a:xfrm>
+                      <a:off x="0" y="0"/>
+                      <a:ext cx="5943600" cy="3342005"/>
+                    </a:xfrm>
+                    <a:prstGeom prst="rect">
+                      <a:avLst/>
+                    </a:prstGeom>
+                  </pic:spPr>
+                </pic:pic>
+              </a:graphicData>
+            </a:graphic>
+          </wp:inline>
+        </w:drawing>
+      </w:r>
+    </w:p>
+    <w:p>
+      <w:pPr>
+        <w:spacing w:before="120" w:after="120" w:line="240" w:lineRule="auto"/>
+        <w:jc w:val="both"/>
+        <w:rPr>
+          <w:rFonts w:cstheme="minorHAnsi"/>
+        </w:rPr>
+      </w:pPr>
+    </w:p>
+    <w:p>
+      <w:pPr>
+        <w:spacing w:before="120" w:after="120" w:line="240" w:lineRule="auto"/>
+        <w:jc w:val="both"/>
+        <w:rPr>
+          <w:rFonts w:cstheme="minorHAnsi"/>
+        </w:rPr>
+      </w:pPr>
+      <w:r>
+        <w:rPr>
+          <w:rFonts w:cstheme="minorHAnsi"/>
+        </w:rPr>
+        <w:t>15. Type2MainFrame — Progress tab (function 11)</w:t>
+      </w:r>
+    </w:p>
+    <w:p>
+      <w:pPr>
+        <w:spacing w:before="120" w:after="120" w:line="240" w:lineRule="auto"/>
+        <w:jc w:val="both"/>
+        <w:rPr>
+          <w:rFonts w:cstheme="minorHAnsi"/>
+        </w:rPr>
+      </w:pPr>
+      <w:r>
+        <w:rPr>
+          <w:rFonts w:cstheme="minorHAnsi"/>
+        </w:rPr>
+        <w:lastRenderedPageBreak/>
+        <w:drawing>
+          <wp:inline distT="0" distB="0" distL="0" distR="0" wp14:anchorId="3C918C05" wp14:editId="16B46B88">
+            <wp:extent cx="5943600" cy="3342005"/>
+            <wp:effectExtent l="0" t="0" r="0" b="0"/>
+            <wp:docPr id="1977417650" name="Picture 1"/>
+            <wp:cNvGraphicFramePr>
+              <a:graphicFrameLocks xmlns:a="http://schemas.openxmlformats.org/drawingml/2006/main" noChangeAspect="1"/>
+            </wp:cNvGraphicFramePr>
+            <a:graphic xmlns:a="http://schemas.openxmlformats.org/drawingml/2006/main">
+              <a:graphicData uri="http://schemas.openxmlformats.org/drawingml/2006/picture">
+                <pic:pic xmlns:pic="http://schemas.openxmlformats.org/drawingml/2006/picture">
+                  <pic:nvPicPr>
+                    <pic:cNvPr id="1977417650" name=""/>
+                    <pic:cNvPicPr/>
+                  </pic:nvPicPr>
+                  <pic:blipFill>
+                    <a:blip r:embed="rId29"/>
+                    <a:stretch>
+                      <a:fillRect/>
+                    </a:stretch>
+                  </pic:blipFill>
+                  <pic:spPr>
+                    <a:xfrm>
+                      <a:off x="0" y="0"/>
+                      <a:ext cx="5943600" cy="3342005"/>
+                    </a:xfrm>
+                    <a:prstGeom prst="rect">
+                      <a:avLst/>
+                    </a:prstGeom>
+                  </pic:spPr>
+                </pic:pic>
+              </a:graphicData>
+            </a:graphic>
+          </wp:inline>
+        </w:drawing>
+      </w:r>
+    </w:p>
+    <w:p>
+      <w:pPr>
+        <w:pStyle w:val="Heading1"/>
+        <w:spacing w:after="240" w:line="240" w:lineRule="auto"/>
+        <w:rPr>
+          <w:rFonts w:asciiTheme="minorHAnsi" w:hAnsiTheme="minorHAnsi" w:cstheme="minorHAnsi"/>
+          <w:b/>
+          <w:color w:val="0070C0"/>
+          <w:sz w:val="28"/>
+          <w:szCs w:val="28"/>
+        </w:rPr>
+      </w:pPr>
+      <w:bookmarkStart w:id="24" w:name="_Toc165838031"/>
+      <w:r>
+        <w:rPr>
+          <w:rFonts w:asciiTheme="minorHAnsi" w:hAnsiTheme="minorHAnsi" w:cstheme="minorHAnsi"/>
+          <w:b/>
+          <w:color w:val="0070C0"/>
+          <w:sz w:val="28"/>
+          <w:szCs w:val="28"/>
+        </w:rPr>
+        <w:t>Conclusion</w:t>
+      </w:r>
+      <w:r>
+        <w:rPr>
+          <w:rFonts w:asciiTheme="minorHAnsi" w:hAnsiTheme="minorHAnsi" w:cstheme="minorHAnsi"/>
+          <w:b/>
+          <w:color w:val="0070C0"/>
+          <w:sz w:val="28"/>
+          <w:szCs w:val="28"/>
+        </w:rPr>
         <w:t xml:space="preserve"> and Future Work</w:t>
       </w:r>
       <w:bookmarkEnd w:id="24"/>
@@ -8079,7 +8762,7 @@
       </w:pPr>
     </w:p>
     <w:sectPr>
-      <w:footerReference w:type="default" r:id="rId15"/>
+      <w:footerReference w:type="default" r:id="rId30"/>
       <w:pgSz w:w="12240" w:h="15840"/>
       <w:pgMar w:top="1440" w:right="1440" w:bottom="1440" w:left="1440" w:header="720" w:footer="720" w:gutter="0"/>
       <w:cols w:space="720"/>
@@ -9104,13 +9787,13 @@
     </w:lvl>
   </w:abstractNum>
   <w:abstractNum w:abstractNumId="7" w15:restartNumberingAfterBreak="0">
-    <w:nsid w:val="179C0109"/>
+    <w:nsid w:val="17DE54EA"/>
     <w:multiLevelType w:val="multilevel"/>
-    <w:tmpl w:val="A3BA9802"/>
+    <w:tmpl w:val="9BF44E4C"/>
     <w:lvl w:ilvl="0">
       <w:start w:val="1"/>
-      <w:numFmt w:val="decimal"/>
-      <w:lvlText w:val="%1."/>
+      <w:numFmt w:val="bullet"/>
+      <w:lvlText w:val=""/>
       <w:lvlJc w:val="left"/>
       <w:pPr>
         <w:tabs>
@@ -9118,11 +9801,15 @@
         </w:tabs>
         <w:ind w:left="720" w:hanging="360"/>
       </w:pPr>
+      <w:rPr>
+        <w:rFonts w:ascii="Symbol" w:hAnsi="Symbol" w:hint="default"/>
+        <w:sz w:val="20"/>
+      </w:rPr>
     </w:lvl>
     <w:lvl w:ilvl="1" w:tentative="1">
       <w:start w:val="1"/>
-      <w:numFmt w:val="decimal"/>
-      <w:lvlText w:val="%2."/>
+      <w:numFmt w:val="bullet"/>
+      <w:lvlText w:val="o"/>
       <w:lvlJc w:val="left"/>
       <w:pPr>
         <w:tabs>
@@ -9130,11 +9817,15 @@
         </w:tabs>
         <w:ind w:left="1440" w:hanging="360"/>
       </w:pPr>
+      <w:rPr>
+        <w:rFonts w:ascii="Courier New" w:hAnsi="Courier New" w:hint="default"/>
+        <w:sz w:val="20"/>
+      </w:rPr>
     </w:lvl>
     <w:lvl w:ilvl="2" w:tentative="1">
       <w:start w:val="1"/>
-      <w:numFmt w:val="decimal"/>
-      <w:lvlText w:val="%3."/>
+      <w:numFmt w:val="bullet"/>
+      <w:lvlText w:val=""/>
       <w:lvlJc w:val="left"/>
       <w:pPr>
         <w:tabs>
@@ -9142,11 +9833,15 @@
         </w:tabs>
         <w:ind w:left="2160" w:hanging="360"/>
       </w:pPr>
+      <w:rPr>
+        <w:rFonts w:ascii="Wingdings" w:hAnsi="Wingdings" w:hint="default"/>
+        <w:sz w:val="20"/>
+      </w:rPr>
     </w:lvl>
     <w:lvl w:ilvl="3" w:tentative="1">
       <w:start w:val="1"/>
-      <w:numFmt w:val="decimal"/>
-      <w:lvlText w:val="%4."/>
+      <w:numFmt w:val="bullet"/>
+      <w:lvlText w:val=""/>
       <w:lvlJc w:val="left"/>
       <w:pPr>
         <w:tabs>
@@ -9154,11 +9849,15 @@
         </w:tabs>
         <w:ind w:left="2880" w:hanging="360"/>
       </w:pPr>
+      <w:rPr>
+        <w:rFonts w:ascii="Wingdings" w:hAnsi="Wingdings" w:hint="default"/>
+        <w:sz w:val="20"/>
+      </w:rPr>
     </w:lvl>
     <w:lvl w:ilvl="4" w:tentative="1">
       <w:start w:val="1"/>
-      <w:numFmt w:val="decimal"/>
-      <w:lvlText w:val="%5."/>
+      <w:numFmt w:val="bullet"/>
+      <w:lvlText w:val=""/>
       <w:lvlJc w:val="left"/>
       <w:pPr>
         <w:tabs>
@@ -9166,11 +9865,15 @@
         </w:tabs>
         <w:ind w:left="3600" w:hanging="360"/>
       </w:pPr>
+      <w:rPr>
+        <w:rFonts w:ascii="Wingdings" w:hAnsi="Wingdings" w:hint="default"/>
+        <w:sz w:val="20"/>
+      </w:rPr>
     </w:lvl>
     <w:lvl w:ilvl="5" w:tentative="1">
       <w:start w:val="1"/>
-      <w:numFmt w:val="decimal"/>
-      <w:lvlText w:val="%6."/>
+      <w:numFmt w:val="bullet"/>
+      <w:lvlText w:val=""/>
       <w:lvlJc w:val="left"/>
       <w:pPr>
         <w:tabs>
@@ -9178,11 +9881,15 @@
         </w:tabs>
         <w:ind w:left="4320" w:hanging="360"/>
       </w:pPr>
+      <w:rPr>
+        <w:rFonts w:ascii="Wingdings" w:hAnsi="Wingdings" w:hint="default"/>
+        <w:sz w:val="20"/>
+      </w:rPr>
     </w:lvl>
     <w:lvl w:ilvl="6" w:tentative="1">
       <w:start w:val="1"/>
-      <w:numFmt w:val="decimal"/>
-      <w:lvlText w:val="%7."/>
+      <w:numFmt w:val="bullet"/>
+      <w:lvlText w:val=""/>
       <w:lvlJc w:val="left"/>
       <w:pPr>
         <w:tabs>
@@ -9190,11 +9897,15 @@
         </w:tabs>
         <w:ind w:left="5040" w:hanging="360"/>
       </w:pPr>
+      <w:rPr>
+        <w:rFonts w:ascii="Wingdings" w:hAnsi="Wingdings" w:hint="default"/>
+        <w:sz w:val="20"/>
+      </w:rPr>
     </w:lvl>
     <w:lvl w:ilvl="7" w:tentative="1">
       <w:start w:val="1"/>
-      <w:numFmt w:val="decimal"/>
-      <w:lvlText w:val="%8."/>
+      <w:numFmt w:val="bullet"/>
+      <w:lvlText w:val=""/>
       <w:lvlJc w:val="left"/>
       <w:pPr>
         <w:tabs>
@@ -9202,11 +9913,15 @@
         </w:tabs>
         <w:ind w:left="5760" w:hanging="360"/>
       </w:pPr>
+      <w:rPr>
+        <w:rFonts w:ascii="Wingdings" w:hAnsi="Wingdings" w:hint="default"/>
+        <w:sz w:val="20"/>
+      </w:rPr>
     </w:lvl>
     <w:lvl w:ilvl="8" w:tentative="1">
       <w:start w:val="1"/>
-      <w:numFmt w:val="decimal"/>
-      <w:lvlText w:val="%9."/>
+      <w:numFmt w:val="bullet"/>
+      <w:lvlText w:val=""/>
       <w:lvlJc w:val="left"/>
       <w:pPr>
         <w:tabs>
@@ -9214,12 +9929,16 @@
         </w:tabs>
         <w:ind w:left="6480" w:hanging="360"/>
       </w:pPr>
+      <w:rPr>
+        <w:rFonts w:ascii="Wingdings" w:hAnsi="Wingdings" w:hint="default"/>
+        <w:sz w:val="20"/>
+      </w:rPr>
     </w:lvl>
   </w:abstractNum>
   <w:abstractNum w:abstractNumId="8" w15:restartNumberingAfterBreak="0">
-    <w:nsid w:val="17DE54EA"/>
+    <w:nsid w:val="31ED7D82"/>
     <w:multiLevelType w:val="multilevel"/>
-    <w:tmpl w:val="9BF44E4C"/>
+    <w:tmpl w:val="4F92E462"/>
     <w:lvl w:ilvl="0">
       <w:start w:val="1"/>
       <w:numFmt w:val="bullet"/>
@@ -9366,13 +10085,13 @@
     </w:lvl>
   </w:abstractNum>
   <w:abstractNum w:abstractNumId="9" w15:restartNumberingAfterBreak="0">
-    <w:nsid w:val="31ED7D82"/>
+    <w:nsid w:val="32483B31"/>
     <w:multiLevelType w:val="multilevel"/>
-    <w:tmpl w:val="4F92E462"/>
+    <w:tmpl w:val="21C4BBB2"/>
     <w:lvl w:ilvl="0">
       <w:start w:val="1"/>
-      <w:numFmt w:val="bullet"/>
-      <w:lvlText w:val=""/>
+      <w:numFmt w:val="decimal"/>
+      <w:lvlText w:val="%1."/>
       <w:lvlJc w:val="left"/>
       <w:pPr>
         <w:tabs>
@@ -9380,6 +10099,232 @@
         </w:tabs>
         <w:ind w:left="720" w:hanging="360"/>
       </w:pPr>
+    </w:lvl>
+    <w:lvl w:ilvl="1" w:tentative="1">
+      <w:start w:val="1"/>
+      <w:numFmt w:val="decimal"/>
+      <w:lvlText w:val="%2."/>
+      <w:lvlJc w:val="left"/>
+      <w:pPr>
+        <w:tabs>
+          <w:tab w:val="num" w:pos="1440"/>
+        </w:tabs>
+        <w:ind w:left="1440" w:hanging="360"/>
+      </w:pPr>
+    </w:lvl>
+    <w:lvl w:ilvl="2" w:tentative="1">
+      <w:start w:val="1"/>
+      <w:numFmt w:val="decimal"/>
+      <w:lvlText w:val="%3."/>
+      <w:lvlJc w:val="left"/>
+      <w:pPr>
+        <w:tabs>
+          <w:tab w:val="num" w:pos="2160"/>
+        </w:tabs>
+        <w:ind w:left="2160" w:hanging="360"/>
+      </w:pPr>
+    </w:lvl>
+    <w:lvl w:ilvl="3" w:tentative="1">
+      <w:start w:val="1"/>
+      <w:numFmt w:val="decimal"/>
+      <w:lvlText w:val="%4."/>
+      <w:lvlJc w:val="left"/>
+      <w:pPr>
+        <w:tabs>
+          <w:tab w:val="num" w:pos="2880"/>
+        </w:tabs>
+        <w:ind w:left="2880" w:hanging="360"/>
+      </w:pPr>
+    </w:lvl>
+    <w:lvl w:ilvl="4" w:tentative="1">
+      <w:start w:val="1"/>
+      <w:numFmt w:val="decimal"/>
+      <w:lvlText w:val="%5."/>
+      <w:lvlJc w:val="left"/>
+      <w:pPr>
+        <w:tabs>
+          <w:tab w:val="num" w:pos="3600"/>
+        </w:tabs>
+        <w:ind w:left="3600" w:hanging="360"/>
+      </w:pPr>
+    </w:lvl>
+    <w:lvl w:ilvl="5" w:tentative="1">
+      <w:start w:val="1"/>
+      <w:numFmt w:val="decimal"/>
+      <w:lvlText w:val="%6."/>
+      <w:lvlJc w:val="left"/>
+      <w:pPr>
+        <w:tabs>
+          <w:tab w:val="num" w:pos="4320"/>
+        </w:tabs>
+        <w:ind w:left="4320" w:hanging="360"/>
+      </w:pPr>
+    </w:lvl>
+    <w:lvl w:ilvl="6" w:tentative="1">
+      <w:start w:val="1"/>
+      <w:numFmt w:val="decimal"/>
+      <w:lvlText w:val="%7."/>
+      <w:lvlJc w:val="left"/>
+      <w:pPr>
+        <w:tabs>
+          <w:tab w:val="num" w:pos="5040"/>
+        </w:tabs>
+        <w:ind w:left="5040" w:hanging="360"/>
+      </w:pPr>
+    </w:lvl>
+    <w:lvl w:ilvl="7" w:tentative="1">
+      <w:start w:val="1"/>
+      <w:numFmt w:val="decimal"/>
+      <w:lvlText w:val="%8."/>
+      <w:lvlJc w:val="left"/>
+      <w:pPr>
+        <w:tabs>
+          <w:tab w:val="num" w:pos="5760"/>
+        </w:tabs>
+        <w:ind w:left="5760" w:hanging="360"/>
+      </w:pPr>
+    </w:lvl>
+    <w:lvl w:ilvl="8" w:tentative="1">
+      <w:start w:val="1"/>
+      <w:numFmt w:val="decimal"/>
+      <w:lvlText w:val="%9."/>
+      <w:lvlJc w:val="left"/>
+      <w:pPr>
+        <w:tabs>
+          <w:tab w:val="num" w:pos="6480"/>
+        </w:tabs>
+        <w:ind w:left="6480" w:hanging="360"/>
+      </w:pPr>
+    </w:lvl>
+  </w:abstractNum>
+  <w:abstractNum w:abstractNumId="10" w15:restartNumberingAfterBreak="0">
+    <w:nsid w:val="348D4E74"/>
+    <w:multiLevelType w:val="multilevel"/>
+    <w:tmpl w:val="0C52F6F8"/>
+    <w:lvl w:ilvl="0">
+      <w:start w:val="1"/>
+      <w:numFmt w:val="decimal"/>
+      <w:lvlText w:val="%1."/>
+      <w:lvlJc w:val="left"/>
+      <w:pPr>
+        <w:tabs>
+          <w:tab w:val="num" w:pos="720"/>
+        </w:tabs>
+        <w:ind w:left="720" w:hanging="360"/>
+      </w:pPr>
+    </w:lvl>
+    <w:lvl w:ilvl="1" w:tentative="1">
+      <w:start w:val="1"/>
+      <w:numFmt w:val="decimal"/>
+      <w:lvlText w:val="%2."/>
+      <w:lvlJc w:val="left"/>
+      <w:pPr>
+        <w:tabs>
+          <w:tab w:val="num" w:pos="1440"/>
+        </w:tabs>
+        <w:ind w:left="1440" w:hanging="360"/>
+      </w:pPr>
+    </w:lvl>
+    <w:lvl w:ilvl="2" w:tentative="1">
+      <w:start w:val="1"/>
+      <w:numFmt w:val="decimal"/>
+      <w:lvlText w:val="%3."/>
+      <w:lvlJc w:val="left"/>
+      <w:pPr>
+        <w:tabs>
+          <w:tab w:val="num" w:pos="2160"/>
+        </w:tabs>
+        <w:ind w:left="2160" w:hanging="360"/>
+      </w:pPr>
+    </w:lvl>
+    <w:lvl w:ilvl="3" w:tentative="1">
+      <w:start w:val="1"/>
+      <w:numFmt w:val="decimal"/>
+      <w:lvlText w:val="%4."/>
+      <w:lvlJc w:val="left"/>
+      <w:pPr>
+        <w:tabs>
+          <w:tab w:val="num" w:pos="2880"/>
+        </w:tabs>
+        <w:ind w:left="2880" w:hanging="360"/>
+      </w:pPr>
+    </w:lvl>
+    <w:lvl w:ilvl="4" w:tentative="1">
+      <w:start w:val="1"/>
+      <w:numFmt w:val="decimal"/>
+      <w:lvlText w:val="%5."/>
+      <w:lvlJc w:val="left"/>
+      <w:pPr>
+        <w:tabs>
+          <w:tab w:val="num" w:pos="3600"/>
+        </w:tabs>
+        <w:ind w:left="3600" w:hanging="360"/>
+      </w:pPr>
+    </w:lvl>
+    <w:lvl w:ilvl="5" w:tentative="1">
+      <w:start w:val="1"/>
+      <w:numFmt w:val="decimal"/>
+      <w:lvlText w:val="%6."/>
+      <w:lvlJc w:val="left"/>
+      <w:pPr>
+        <w:tabs>
+          <w:tab w:val="num" w:pos="4320"/>
+        </w:tabs>
+        <w:ind w:left="4320" w:hanging="360"/>
+      </w:pPr>
+    </w:lvl>
+    <w:lvl w:ilvl="6" w:tentative="1">
+      <w:start w:val="1"/>
+      <w:numFmt w:val="decimal"/>
+      <w:lvlText w:val="%7."/>
+      <w:lvlJc w:val="left"/>
+      <w:pPr>
+        <w:tabs>
+          <w:tab w:val="num" w:pos="5040"/>
+        </w:tabs>
+        <w:ind w:left="5040" w:hanging="360"/>
+      </w:pPr>
+    </w:lvl>
+    <w:lvl w:ilvl="7" w:tentative="1">
+      <w:start w:val="1"/>
+      <w:numFmt w:val="decimal"/>
+      <w:lvlText w:val="%8."/>
+      <w:lvlJc w:val="left"/>
+      <w:pPr>
+        <w:tabs>
+          <w:tab w:val="num" w:pos="5760"/>
+        </w:tabs>
+        <w:ind w:left="5760" w:hanging="360"/>
+      </w:pPr>
+    </w:lvl>
+    <w:lvl w:ilvl="8" w:tentative="1">
+      <w:start w:val="1"/>
+      <w:numFmt w:val="decimal"/>
+      <w:lvlText w:val="%9."/>
+      <w:lvlJc w:val="left"/>
+      <w:pPr>
+        <w:tabs>
+          <w:tab w:val="num" w:pos="6480"/>
+        </w:tabs>
+        <w:ind w:left="6480" w:hanging="360"/>
+      </w:pPr>
+    </w:lvl>
+  </w:abstractNum>
+  <w:abstractNum w:abstractNumId="11" w15:restartNumberingAfterBreak="0">
+    <w:nsid w:val="39A22F8D"/>
+    <w:multiLevelType w:val="multilevel"/>
+    <w:tmpl w:val="D2C8E4B6"/>
+    <w:lvl w:ilvl="0">
+      <w:start w:val="1"/>
+      <w:numFmt w:val="bullet"/>
+      <w:lvlText w:val=""/>
+      <w:lvlJc w:val="left"/>
+      <w:pPr>
+        <w:tabs>
+          <w:tab w:val="num" w:pos="720"/>
+        </w:tabs>
+        <w:ind w:left="720" w:hanging="360"/>
+      </w:pPr>
       <w:rPr>
         <w:rFonts w:ascii="Symbol" w:hAnsi="Symbol" w:hint="default"/>
         <w:sz w:val="20"/>
@@ -9514,382 +10459,7 @@
       </w:rPr>
     </w:lvl>
   </w:abstractNum>
-  <w:abstractNum w:abstractNumId="10" w15:restartNumberingAfterBreak="0">
-    <w:nsid w:val="32483B31"/>
-    <w:multiLevelType w:val="multilevel"/>
-    <w:tmpl w:val="21C4BBB2"/>
-    <w:lvl w:ilvl="0">
-      <w:start w:val="1"/>
-      <w:numFmt w:val="decimal"/>
-      <w:lvlText w:val="%1."/>
-      <w:lvlJc w:val="left"/>
-      <w:pPr>
-        <w:tabs>
-          <w:tab w:val="num" w:pos="720"/>
-        </w:tabs>
-        <w:ind w:left="720" w:hanging="360"/>
-      </w:pPr>
-    </w:lvl>
-    <w:lvl w:ilvl="1" w:tentative="1">
-      <w:start w:val="1"/>
-      <w:numFmt w:val="decimal"/>
-      <w:lvlText w:val="%2."/>
-      <w:lvlJc w:val="left"/>
-      <w:pPr>
-        <w:tabs>
-          <w:tab w:val="num" w:pos="1440"/>
-        </w:tabs>
-        <w:ind w:left="1440" w:hanging="360"/>
-      </w:pPr>
-    </w:lvl>
-    <w:lvl w:ilvl="2" w:tentative="1">
-      <w:start w:val="1"/>
-      <w:numFmt w:val="decimal"/>
-      <w:lvlText w:val="%3."/>
-      <w:lvlJc w:val="left"/>
-      <w:pPr>
-        <w:tabs>
-          <w:tab w:val="num" w:pos="2160"/>
-        </w:tabs>
-        <w:ind w:left="2160" w:hanging="360"/>
-      </w:pPr>
-    </w:lvl>
-    <w:lvl w:ilvl="3" w:tentative="1">
-      <w:start w:val="1"/>
-      <w:numFmt w:val="decimal"/>
-      <w:lvlText w:val="%4."/>
-      <w:lvlJc w:val="left"/>
-      <w:pPr>
-        <w:tabs>
-          <w:tab w:val="num" w:pos="2880"/>
-        </w:tabs>
-        <w:ind w:left="2880" w:hanging="360"/>
-      </w:pPr>
-    </w:lvl>
-    <w:lvl w:ilvl="4" w:tentative="1">
-      <w:start w:val="1"/>
-      <w:numFmt w:val="decimal"/>
-      <w:lvlText w:val="%5."/>
-      <w:lvlJc w:val="left"/>
-      <w:pPr>
-        <w:tabs>
-          <w:tab w:val="num" w:pos="3600"/>
-        </w:tabs>
-        <w:ind w:left="3600" w:hanging="360"/>
-      </w:pPr>
-    </w:lvl>
-    <w:lvl w:ilvl="5" w:tentative="1">
-      <w:start w:val="1"/>
-      <w:numFmt w:val="decimal"/>
-      <w:lvlText w:val="%6."/>
-      <w:lvlJc w:val="left"/>
-      <w:pPr>
-        <w:tabs>
-          <w:tab w:val="num" w:pos="4320"/>
-        </w:tabs>
-        <w:ind w:left="4320" w:hanging="360"/>
-      </w:pPr>
-    </w:lvl>
-    <w:lvl w:ilvl="6" w:tentative="1">
-      <w:start w:val="1"/>
-      <w:numFmt w:val="decimal"/>
-      <w:lvlText w:val="%7."/>
-      <w:lvlJc w:val="left"/>
-      <w:pPr>
-        <w:tabs>
-          <w:tab w:val="num" w:pos="5040"/>
-        </w:tabs>
-        <w:ind w:left="5040" w:hanging="360"/>
-      </w:pPr>
-    </w:lvl>
-    <w:lvl w:ilvl="7" w:tentative="1">
-      <w:start w:val="1"/>
-      <w:numFmt w:val="decimal"/>
-      <w:lvlText w:val="%8."/>
-      <w:lvlJc w:val="left"/>
-      <w:pPr>
-        <w:tabs>
-          <w:tab w:val="num" w:pos="5760"/>
-        </w:tabs>
-        <w:ind w:left="5760" w:hanging="360"/>
-      </w:pPr>
-    </w:lvl>
-    <w:lvl w:ilvl="8" w:tentative="1">
-      <w:start w:val="1"/>
-      <w:numFmt w:val="decimal"/>
-      <w:lvlText w:val="%9."/>
-      <w:lvlJc w:val="left"/>
-      <w:pPr>
-        <w:tabs>
-          <w:tab w:val="num" w:pos="6480"/>
-        </w:tabs>
-        <w:ind w:left="6480" w:hanging="360"/>
-      </w:pPr>
-    </w:lvl>
-  </w:abstractNum>
-  <w:abstractNum w:abstractNumId="11" w15:restartNumberingAfterBreak="0">
-    <w:nsid w:val="348D4E74"/>
-    <w:multiLevelType w:val="multilevel"/>
-    <w:tmpl w:val="0C52F6F8"/>
-    <w:lvl w:ilvl="0">
-      <w:start w:val="1"/>
-      <w:numFmt w:val="decimal"/>
-      <w:lvlText w:val="%1."/>
-      <w:lvlJc w:val="left"/>
-      <w:pPr>
-        <w:tabs>
-          <w:tab w:val="num" w:pos="720"/>
-        </w:tabs>
-        <w:ind w:left="720" w:hanging="360"/>
-      </w:pPr>
-    </w:lvl>
-    <w:lvl w:ilvl="1" w:tentative="1">
-      <w:start w:val="1"/>
-      <w:numFmt w:val="decimal"/>
-      <w:lvlText w:val="%2."/>
-      <w:lvlJc w:val="left"/>
-      <w:pPr>
-        <w:tabs>
-          <w:tab w:val="num" w:pos="1440"/>
-        </w:tabs>
-        <w:ind w:left="1440" w:hanging="360"/>
-      </w:pPr>
-    </w:lvl>
-    <w:lvl w:ilvl="2" w:tentative="1">
-      <w:start w:val="1"/>
-      <w:numFmt w:val="decimal"/>
-      <w:lvlText w:val="%3."/>
-      <w:lvlJc w:val="left"/>
-      <w:pPr>
-        <w:tabs>
-          <w:tab w:val="num" w:pos="2160"/>
-        </w:tabs>
-        <w:ind w:left="2160" w:hanging="360"/>
-      </w:pPr>
-    </w:lvl>
-    <w:lvl w:ilvl="3" w:tentative="1">
-      <w:start w:val="1"/>
-      <w:numFmt w:val="decimal"/>
-      <w:lvlText w:val="%4."/>
-      <w:lvlJc w:val="left"/>
-      <w:pPr>
-        <w:tabs>
-          <w:tab w:val="num" w:pos="2880"/>
-        </w:tabs>
-        <w:ind w:left="2880" w:hanging="360"/>
-      </w:pPr>
-    </w:lvl>
-    <w:lvl w:ilvl="4" w:tentative="1">
-      <w:start w:val="1"/>
-      <w:numFmt w:val="decimal"/>
-      <w:lvlText w:val="%5."/>
-      <w:lvlJc w:val="left"/>
-      <w:pPr>
-        <w:tabs>
-          <w:tab w:val="num" w:pos="3600"/>
-        </w:tabs>
-        <w:ind w:left="3600" w:hanging="360"/>
-      </w:pPr>
-    </w:lvl>
-    <w:lvl w:ilvl="5" w:tentative="1">
-      <w:start w:val="1"/>
-      <w:numFmt w:val="decimal"/>
-      <w:lvlText w:val="%6."/>
-      <w:lvlJc w:val="left"/>
-      <w:pPr>
-        <w:tabs>
-          <w:tab w:val="num" w:pos="4320"/>
-        </w:tabs>
-        <w:ind w:left="4320" w:hanging="360"/>
-      </w:pPr>
-    </w:lvl>
-    <w:lvl w:ilvl="6" w:tentative="1">
-      <w:start w:val="1"/>
-      <w:numFmt w:val="decimal"/>
-      <w:lvlText w:val="%7."/>
-      <w:lvlJc w:val="left"/>
-      <w:pPr>
-        <w:tabs>
-          <w:tab w:val="num" w:pos="5040"/>
-        </w:tabs>
-        <w:ind w:left="5040" w:hanging="360"/>
-      </w:pPr>
-    </w:lvl>
-    <w:lvl w:ilvl="7" w:tentative="1">
-      <w:start w:val="1"/>
-      <w:numFmt w:val="decimal"/>
-      <w:lvlText w:val="%8."/>
-      <w:lvlJc w:val="left"/>
-      <w:pPr>
-        <w:tabs>
-          <w:tab w:val="num" w:pos="5760"/>
-        </w:tabs>
-        <w:ind w:left="5760" w:hanging="360"/>
-      </w:pPr>
-    </w:lvl>
-    <w:lvl w:ilvl="8" w:tentative="1">
-      <w:start w:val="1"/>
-      <w:numFmt w:val="decimal"/>
-      <w:lvlText w:val="%9."/>
-      <w:lvlJc w:val="left"/>
-      <w:pPr>
-        <w:tabs>
-          <w:tab w:val="num" w:pos="6480"/>
-        </w:tabs>
-        <w:ind w:left="6480" w:hanging="360"/>
-      </w:pPr>
-    </w:lvl>
-  </w:abstractNum>
   <w:abstractNum w:abstractNumId="12" w15:restartNumberingAfterBreak="0">
-    <w:nsid w:val="39A22F8D"/>
-    <w:multiLevelType w:val="multilevel"/>
-    <w:tmpl w:val="D2C8E4B6"/>
-    <w:lvl w:ilvl="0">
-      <w:start w:val="1"/>
-      <w:numFmt w:val="bullet"/>
-      <w:lvlText w:val=""/>
-      <w:lvlJc w:val="left"/>
-      <w:pPr>
-        <w:tabs>
-          <w:tab w:val="num" w:pos="720"/>
-        </w:tabs>
-        <w:ind w:left="720" w:hanging="360"/>
-      </w:pPr>
-      <w:rPr>
-        <w:rFonts w:ascii="Symbol" w:hAnsi="Symbol" w:hint="default"/>
-        <w:sz w:val="20"/>
-      </w:rPr>
-    </w:lvl>
-    <w:lvl w:ilvl="1" w:tentative="1">
-      <w:start w:val="1"/>
-      <w:numFmt w:val="bullet"/>
-      <w:lvlText w:val="o"/>
-      <w:lvlJc w:val="left"/>
-      <w:pPr>
-        <w:tabs>
-          <w:tab w:val="num" w:pos="1440"/>
-        </w:tabs>
-        <w:ind w:left="1440" w:hanging="360"/>
-      </w:pPr>
-      <w:rPr>
-        <w:rFonts w:ascii="Courier New" w:hAnsi="Courier New" w:hint="default"/>
-        <w:sz w:val="20"/>
-      </w:rPr>
-    </w:lvl>
-    <w:lvl w:ilvl="2" w:tentative="1">
-      <w:start w:val="1"/>
-      <w:numFmt w:val="bullet"/>
-      <w:lvlText w:val=""/>
-      <w:lvlJc w:val="left"/>
-      <w:pPr>
-        <w:tabs>
-          <w:tab w:val="num" w:pos="2160"/>
-        </w:tabs>
-        <w:ind w:left="2160" w:hanging="360"/>
-      </w:pPr>
-      <w:rPr>
-        <w:rFonts w:ascii="Wingdings" w:hAnsi="Wingdings" w:hint="default"/>
-        <w:sz w:val="20"/>
-      </w:rPr>
-    </w:lvl>
-    <w:lvl w:ilvl="3" w:tentative="1">
-      <w:start w:val="1"/>
-      <w:numFmt w:val="bullet"/>
-      <w:lvlText w:val=""/>
-      <w:lvlJc w:val="left"/>
-      <w:pPr>
-        <w:tabs>
-          <w:tab w:val="num" w:pos="2880"/>
-        </w:tabs>
-        <w:ind w:left="2880" w:hanging="360"/>
-      </w:pPr>
-      <w:rPr>
-        <w:rFonts w:ascii="Wingdings" w:hAnsi="Wingdings" w:hint="default"/>
-        <w:sz w:val="20"/>
-      </w:rPr>
-    </w:lvl>
-    <w:lvl w:ilvl="4" w:tentative="1">
-      <w:start w:val="1"/>
-      <w:numFmt w:val="bullet"/>
-      <w:lvlText w:val=""/>
-      <w:lvlJc w:val="left"/>
-      <w:pPr>
-        <w:tabs>
-          <w:tab w:val="num" w:pos="3600"/>
-        </w:tabs>
-        <w:ind w:left="3600" w:hanging="360"/>
-      </w:pPr>
-      <w:rPr>
-        <w:rFonts w:ascii="Wingdings" w:hAnsi="Wingdings" w:hint="default"/>
-        <w:sz w:val="20"/>
-      </w:rPr>
-    </w:lvl>
-    <w:lvl w:ilvl="5" w:tentative="1">
-      <w:start w:val="1"/>
-      <w:numFmt w:val="bullet"/>
-      <w:lvlText w:val=""/>
-      <w:lvlJc w:val="left"/>
-      <w:pPr>
-        <w:tabs>
-          <w:tab w:val="num" w:pos="4320"/>
-        </w:tabs>
-        <w:ind w:left="4320" w:hanging="360"/>
-      </w:pPr>
-      <w:rPr>
-        <w:rFonts w:ascii="Wingdings" w:hAnsi="Wingdings" w:hint="default"/>
-        <w:sz w:val="20"/>
-      </w:rPr>
-    </w:lvl>
-    <w:lvl w:ilvl="6" w:tentative="1">
-      <w:start w:val="1"/>
-      <w:numFmt w:val="bullet"/>
-      <w:lvlText w:val=""/>
-      <w:lvlJc w:val="left"/>
-      <w:pPr>
-        <w:tabs>
-          <w:tab w:val="num" w:pos="5040"/>
-        </w:tabs>
-        <w:ind w:left="5040" w:hanging="360"/>
-      </w:pPr>
-      <w:rPr>
-        <w:rFonts w:ascii="Wingdings" w:hAnsi="Wingdings" w:hint="default"/>
-        <w:sz w:val="20"/>
-      </w:rPr>
-    </w:lvl>
-    <w:lvl w:ilvl="7" w:tentative="1">
-      <w:start w:val="1"/>
-      <w:numFmt w:val="bullet"/>
-      <w:lvlText w:val=""/>
-      <w:lvlJc w:val="left"/>
-      <w:pPr>
-        <w:tabs>
-          <w:tab w:val="num" w:pos="5760"/>
-        </w:tabs>
-        <w:ind w:left="5760" w:hanging="360"/>
-      </w:pPr>
-      <w:rPr>
-        <w:rFonts w:ascii="Wingdings" w:hAnsi="Wingdings" w:hint="default"/>
-        <w:sz w:val="20"/>
-      </w:rPr>
-    </w:lvl>
-    <w:lvl w:ilvl="8" w:tentative="1">
-      <w:start w:val="1"/>
-      <w:numFmt w:val="bullet"/>
-      <w:lvlText w:val=""/>
-      <w:lvlJc w:val="left"/>
-      <w:pPr>
-        <w:tabs>
-          <w:tab w:val="num" w:pos="6480"/>
-        </w:tabs>
-        <w:ind w:left="6480" w:hanging="360"/>
-      </w:pPr>
-      <w:rPr>
-        <w:rFonts w:ascii="Wingdings" w:hAnsi="Wingdings" w:hint="default"/>
-        <w:sz w:val="20"/>
-      </w:rPr>
-    </w:lvl>
-  </w:abstractNum>
-  <w:abstractNum w:abstractNumId="13" w15:restartNumberingAfterBreak="0">
     <w:nsid w:val="3FFA09EA"/>
     <w:multiLevelType w:val="multilevel"/>
     <w:tmpl w:val="0409001F"/>
@@ -9976,7 +10546,7 @@
       </w:pPr>
     </w:lvl>
   </w:abstractNum>
-  <w:abstractNum w:abstractNumId="14" w15:restartNumberingAfterBreak="0">
+  <w:abstractNum w:abstractNumId="13" w15:restartNumberingAfterBreak="0">
     <w:nsid w:val="48470790"/>
     <w:multiLevelType w:val="multilevel"/>
     <w:tmpl w:val="0409001F"/>
@@ -10063,7 +10633,7 @@
       </w:pPr>
     </w:lvl>
   </w:abstractNum>
-  <w:abstractNum w:abstractNumId="15" w15:restartNumberingAfterBreak="0">
+  <w:abstractNum w:abstractNumId="14" w15:restartNumberingAfterBreak="0">
     <w:nsid w:val="4FED70E1"/>
     <w:multiLevelType w:val="multilevel"/>
     <w:tmpl w:val="04090025"/>
@@ -10158,7 +10728,7 @@
       </w:pPr>
     </w:lvl>
   </w:abstractNum>
-  <w:abstractNum w:abstractNumId="16" w15:restartNumberingAfterBreak="0">
+  <w:abstractNum w:abstractNumId="15" w15:restartNumberingAfterBreak="0">
     <w:nsid w:val="59C81406"/>
     <w:multiLevelType w:val="multilevel"/>
     <w:tmpl w:val="069A8B58"/>
@@ -10271,7 +10841,7 @@
       </w:pPr>
     </w:lvl>
   </w:abstractNum>
-  <w:abstractNum w:abstractNumId="17" w15:restartNumberingAfterBreak="0">
+  <w:abstractNum w:abstractNumId="16" w15:restartNumberingAfterBreak="0">
     <w:nsid w:val="67B966F6"/>
     <w:multiLevelType w:val="hybridMultilevel"/>
     <w:tmpl w:val="7AA44224"/>
@@ -10384,7 +10954,7 @@
       </w:rPr>
     </w:lvl>
   </w:abstractNum>
-  <w:abstractNum w:abstractNumId="18" w15:restartNumberingAfterBreak="0">
+  <w:abstractNum w:abstractNumId="17" w15:restartNumberingAfterBreak="0">
     <w:nsid w:val="681405F8"/>
     <w:multiLevelType w:val="multilevel"/>
     <w:tmpl w:val="4AC49F0A"/>
@@ -10533,7 +11103,7 @@
       </w:rPr>
     </w:lvl>
   </w:abstractNum>
-  <w:abstractNum w:abstractNumId="19" w15:restartNumberingAfterBreak="0">
+  <w:abstractNum w:abstractNumId="18" w15:restartNumberingAfterBreak="0">
     <w:nsid w:val="6E89496A"/>
     <w:multiLevelType w:val="hybridMultilevel"/>
     <w:tmpl w:val="7728A2B8"/>
@@ -10646,7 +11216,7 @@
       </w:rPr>
     </w:lvl>
   </w:abstractNum>
-  <w:abstractNum w:abstractNumId="20" w15:restartNumberingAfterBreak="0">
+  <w:abstractNum w:abstractNumId="19" w15:restartNumberingAfterBreak="0">
     <w:nsid w:val="752C7A79"/>
     <w:multiLevelType w:val="multilevel"/>
     <w:tmpl w:val="0409001F"/>
@@ -10733,7 +11303,7 @@
       </w:pPr>
     </w:lvl>
   </w:abstractNum>
-  <w:abstractNum w:abstractNumId="21" w15:restartNumberingAfterBreak="0">
+  <w:abstractNum w:abstractNumId="20" w15:restartNumberingAfterBreak="0">
     <w:nsid w:val="786C0E74"/>
     <w:multiLevelType w:val="multilevel"/>
     <w:tmpl w:val="0409001F"/>
@@ -10824,40 +11394,40 @@
     <w:abstractNumId w:val="1"/>
   </w:num>
   <w:num w:numId="2" w16cid:durableId="2024016957">
-    <w:abstractNumId w:val="21"/>
+    <w:abstractNumId w:val="20"/>
   </w:num>
   <w:num w:numId="3" w16cid:durableId="222110166">
-    <w:abstractNumId w:val="14"/>
+    <w:abstractNumId w:val="13"/>
   </w:num>
   <w:num w:numId="4" w16cid:durableId="846096358">
-    <w:abstractNumId w:val="20"/>
+    <w:abstractNumId w:val="19"/>
   </w:num>
   <w:num w:numId="5" w16cid:durableId="279843498">
-    <w:abstractNumId w:val="13"/>
+    <w:abstractNumId w:val="12"/>
   </w:num>
   <w:num w:numId="6" w16cid:durableId="1371537603">
-    <w:abstractNumId w:val="15"/>
+    <w:abstractNumId w:val="14"/>
   </w:num>
   <w:num w:numId="7" w16cid:durableId="433205859">
     <w:abstractNumId w:val="2"/>
   </w:num>
   <w:num w:numId="8" w16cid:durableId="472336413">
+    <w:abstractNumId w:val="10"/>
+  </w:num>
+  <w:num w:numId="9" w16cid:durableId="302739204">
+    <w:abstractNumId w:val="9"/>
+  </w:num>
+  <w:num w:numId="10" w16cid:durableId="1834222081">
     <w:abstractNumId w:val="11"/>
   </w:num>
-  <w:num w:numId="9" w16cid:durableId="302739204">
-    <w:abstractNumId w:val="10"/>
-  </w:num>
-  <w:num w:numId="10" w16cid:durableId="1834222081">
-    <w:abstractNumId w:val="12"/>
-  </w:num>
   <w:num w:numId="11" w16cid:durableId="1870214997">
-    <w:abstractNumId w:val="16"/>
+    <w:abstractNumId w:val="15"/>
   </w:num>
   <w:num w:numId="12" w16cid:durableId="2000839093">
     <w:abstractNumId w:val="5"/>
   </w:num>
   <w:num w:numId="13" w16cid:durableId="344290134">
-    <w:abstractNumId w:val="9"/>
+    <w:abstractNumId w:val="8"/>
   </w:num>
   <w:num w:numId="14" w16cid:durableId="936133753">
     <w:abstractNumId w:val="4"/>
@@ -10866,25 +11436,25 @@
     <w:abstractNumId w:val="3"/>
   </w:num>
   <w:num w:numId="16" w16cid:durableId="1647466885">
-    <w:abstractNumId w:val="18"/>
+    <w:abstractNumId w:val="17"/>
   </w:num>
   <w:num w:numId="17" w16cid:durableId="669261522">
     <w:abstractNumId w:val="6"/>
   </w:num>
   <w:num w:numId="18" w16cid:durableId="309017066">
-    <w:abstractNumId w:val="8"/>
+    <w:abstractNumId w:val="7"/>
   </w:num>
   <w:num w:numId="19" w16cid:durableId="1738284933">
-    <w:abstractNumId w:val="17"/>
+    <w:abstractNumId w:val="16"/>
   </w:num>
   <w:num w:numId="20" w16cid:durableId="1167552902">
-    <w:abstractNumId w:val="19"/>
+    <w:abstractNumId w:val="18"/>
   </w:num>
   <w:num w:numId="21" w16cid:durableId="2079937034">
     <w:abstractNumId w:val="0"/>
   </w:num>
   <w:num w:numId="22" w16cid:durableId="998728492">
-    <w:abstractNumId w:val="15"/>
+    <w:abstractNumId w:val="14"/>
     <w:lvlOverride w:ilvl="0">
       <w:startOverride w:val="4"/>
     </w:lvlOverride>
@@ -10895,10 +11465,7 @@
       <w:startOverride w:val="2"/>
     </w:lvlOverride>
   </w:num>
-  <w:num w:numId="23" w16cid:durableId="388111934">
-    <w:abstractNumId w:val="7"/>
-  </w:num>
-  <w:numIdMacAtCleanup w:val="23"/>
+  <w:numIdMacAtCleanup w:val="22"/>
 </w:numbering>
 </file>
 

</xml_diff>